<commit_message>
Make the worksheet rubric a proper grid
Header row (Level / Focus / What you need to show) on a dark band, alternating
row shading, visible borders on every cell, generous padding, and body text
back up from 12pt to 14pt. No worked examples, still Levels 5-9 only. Trimmed
one rewrite line to keep the page fitting with margin.
</commit_message>
<xml_diff>
--- a/BoneSparrow-draft-and-rewrite.docx
+++ b/BoneSparrow-draft-and-rewrite.docx
@@ -122,21 +122,6 @@
           <w:szCs w:val="15"/>
         </w:rPr>
         <w:t xml:space="preserve">DRAFT</w:t>
-      </w:r>
-    </w:p>
-    <w:p>
-      <w:pPr>
-        <w:pBdr>
-          <w:bottom w:val="single" w:color="C9BFAE" w:sz="4" w:space="1"/>
-        </w:pBdr>
-        <w:spacing w:after="80" w:before="0" w:line="340"/>
-      </w:pPr>
-      <w:r>
-        <w:rPr>
-          <w:sz w:val="20"/>
-          <w:szCs w:val="20"/>
-        </w:rPr>
-        <w:t xml:space="preserve"/>
       </w:r>
     </w:p>
     <w:p>
@@ -244,26 +229,130 @@
         </w:tblBorders>
       </w:tblPr>
       <w:tblGrid>
-        <w:gridCol w:w="600"/>
-        <w:gridCol w:w="1550"/>
-        <w:gridCol w:w="7596"/>
+        <w:gridCol w:w="750"/>
+        <w:gridCol w:w="1800"/>
+        <w:gridCol w:w="7196"/>
       </w:tblGrid>
       <w:tr>
-        <w:tc>
-          <w:tcPr>
-            <w:tcW w:type="dxa" w:w="600"/>
-            <w:tcBorders>
-              <w:top w:val="single" w:color="C9BFAE" w:sz="2"/>
-              <w:left w:val="single" w:color="C9BFAE" w:sz="2"/>
-              <w:bottom w:val="single" w:color="C9BFAE" w:sz="2"/>
-              <w:right w:val="single" w:color="C9BFAE" w:sz="2"/>
+        <w:trPr>
+          <w:tblHeader/>
+        </w:trPr>
+        <w:tc>
+          <w:tcPr>
+            <w:tcW w:type="dxa" w:w="750"/>
+            <w:tcBorders>
+              <w:top w:val="single" w:color="9C9382" w:sz="4"/>
+              <w:left w:val="single" w:color="9C9382" w:sz="4"/>
+              <w:bottom w:val="single" w:color="9C9382" w:sz="4"/>
+              <w:right w:val="single" w:color="9C9382" w:sz="4"/>
+            </w:tcBorders>
+            <w:shd w:fill="1D3C34" w:color="auto" w:val="clear"/>
+            <w:tcMar>
+              <w:top w:type="dxa" w:w="70"/>
+              <w:left w:type="dxa" w:w="110"/>
+              <w:bottom w:type="dxa" w:w="70"/>
+              <w:right w:type="dxa" w:w="110"/>
+            </w:tcMar>
+            <w:vAlign w:val="center"/>
+          </w:tcPr>
+          <w:p>
+            <w:r>
+              <w:rPr>
+                <w:rFonts w:ascii="Calibri" w:cs="Calibri" w:eastAsia="Calibri" w:hAnsi="Calibri"/>
+                <w:b/>
+                <w:bCs/>
+                <w:color w:val="F6F1E6"/>
+                <w:spacing w:val="14"/>
+                <w:sz w:val="15"/>
+                <w:szCs w:val="15"/>
+              </w:rPr>
+              <w:t xml:space="preserve">Level</w:t>
+            </w:r>
+          </w:p>
+        </w:tc>
+        <w:tc>
+          <w:tcPr>
+            <w:tcW w:type="dxa" w:w="1800"/>
+            <w:tcBorders>
+              <w:top w:val="single" w:color="9C9382" w:sz="4"/>
+              <w:left w:val="single" w:color="9C9382" w:sz="4"/>
+              <w:bottom w:val="single" w:color="9C9382" w:sz="4"/>
+              <w:right w:val="single" w:color="9C9382" w:sz="4"/>
+            </w:tcBorders>
+            <w:shd w:fill="1D3C34" w:color="auto" w:val="clear"/>
+            <w:tcMar>
+              <w:top w:type="dxa" w:w="70"/>
+              <w:left w:type="dxa" w:w="110"/>
+              <w:bottom w:type="dxa" w:w="70"/>
+              <w:right w:type="dxa" w:w="110"/>
+            </w:tcMar>
+            <w:vAlign w:val="center"/>
+          </w:tcPr>
+          <w:p>
+            <w:r>
+              <w:rPr>
+                <w:rFonts w:ascii="Calibri" w:cs="Calibri" w:eastAsia="Calibri" w:hAnsi="Calibri"/>
+                <w:b/>
+                <w:bCs/>
+                <w:color w:val="F6F1E6"/>
+                <w:spacing w:val="14"/>
+                <w:sz w:val="15"/>
+                <w:szCs w:val="15"/>
+              </w:rPr>
+              <w:t xml:space="preserve">Focus</w:t>
+            </w:r>
+          </w:p>
+        </w:tc>
+        <w:tc>
+          <w:tcPr>
+            <w:tcW w:type="dxa" w:w="7196"/>
+            <w:tcBorders>
+              <w:top w:val="single" w:color="9C9382" w:sz="4"/>
+              <w:left w:val="single" w:color="9C9382" w:sz="4"/>
+              <w:bottom w:val="single" w:color="9C9382" w:sz="4"/>
+              <w:right w:val="single" w:color="9C9382" w:sz="4"/>
+            </w:tcBorders>
+            <w:shd w:fill="1D3C34" w:color="auto" w:val="clear"/>
+            <w:tcMar>
+              <w:top w:type="dxa" w:w="70"/>
+              <w:left w:type="dxa" w:w="110"/>
+              <w:bottom w:type="dxa" w:w="70"/>
+              <w:right w:type="dxa" w:w="110"/>
+            </w:tcMar>
+            <w:vAlign w:val="center"/>
+          </w:tcPr>
+          <w:p>
+            <w:r>
+              <w:rPr>
+                <w:rFonts w:ascii="Calibri" w:cs="Calibri" w:eastAsia="Calibri" w:hAnsi="Calibri"/>
+                <w:b/>
+                <w:bCs/>
+                <w:color w:val="F6F1E6"/>
+                <w:spacing w:val="14"/>
+                <w:sz w:val="15"/>
+                <w:szCs w:val="15"/>
+              </w:rPr>
+              <w:t xml:space="preserve">What you need to show</w:t>
+            </w:r>
+          </w:p>
+        </w:tc>
+      </w:tr>
+      <w:tr>
+        <w:tc>
+          <w:tcPr>
+            <w:tcW w:type="dxa" w:w="750"/>
+            <w:tcBorders>
+              <w:top w:val="single" w:color="9C9382" w:sz="4"/>
+              <w:left w:val="single" w:color="9C9382" w:sz="4"/>
+              <w:bottom w:val="single" w:color="9C9382" w:sz="4"/>
+              <w:right w:val="single" w:color="9C9382" w:sz="4"/>
             </w:tcBorders>
             <w:shd w:fill="F4EFE5" w:color="auto" w:val="clear"/>
             <w:tcMar>
-              <w:top w:type="dxa" w:w="30"/>
-              <w:left w:type="dxa" w:w="70"/>
-              <w:bottom w:type="dxa" w:w="30"/>
-              <w:right w:type="dxa" w:w="70"/>
+              <w:top w:type="dxa" w:w="70"/>
+              <w:left w:type="dxa" w:w="110"/>
+              <w:bottom w:type="dxa" w:w="70"/>
+              <w:right w:type="dxa" w:w="110"/>
             </w:tcMar>
             <w:vAlign w:val="center"/>
           </w:tcPr>
@@ -277,8 +366,8 @@
                 <w:b/>
                 <w:bCs/>
                 <w:color w:val="1D3C34"/>
-                <w:sz w:val="14"/>
-                <w:szCs w:val="14"/>
+                <w:sz w:val="18"/>
+                <w:szCs w:val="18"/>
               </w:rPr>
               <w:t xml:space="preserve">5</w:t>
             </w:r>
@@ -286,18 +375,19 @@
         </w:tc>
         <w:tc>
           <w:tcPr>
-            <w:tcW w:type="dxa" w:w="1550"/>
-            <w:tcBorders>
-              <w:top w:val="single" w:color="C9BFAE" w:sz="2"/>
-              <w:left w:val="single" w:color="C9BFAE" w:sz="2"/>
-              <w:bottom w:val="single" w:color="C9BFAE" w:sz="2"/>
-              <w:right w:val="single" w:color="C9BFAE" w:sz="2"/>
-            </w:tcBorders>
-            <w:tcMar>
-              <w:top w:type="dxa" w:w="30"/>
-              <w:left w:type="dxa" w:w="70"/>
-              <w:bottom w:type="dxa" w:w="30"/>
-              <w:right w:type="dxa" w:w="70"/>
+            <w:tcW w:type="dxa" w:w="1800"/>
+            <w:tcBorders>
+              <w:top w:val="single" w:color="9C9382" w:sz="4"/>
+              <w:left w:val="single" w:color="9C9382" w:sz="4"/>
+              <w:bottom w:val="single" w:color="9C9382" w:sz="4"/>
+              <w:right w:val="single" w:color="9C9382" w:sz="4"/>
+            </w:tcBorders>
+            <w:shd w:fill="F4EFE5" w:color="auto" w:val="clear"/>
+            <w:tcMar>
+              <w:top w:type="dxa" w:w="70"/>
+              <w:left w:type="dxa" w:w="110"/>
+              <w:bottom w:type="dxa" w:w="70"/>
+              <w:right w:type="dxa" w:w="110"/>
             </w:tcMar>
             <w:vAlign w:val="center"/>
           </w:tcPr>
@@ -308,8 +398,8 @@
                 <w:b/>
                 <w:bCs/>
                 <w:color w:val="1E211F"/>
-                <w:sz w:val="12"/>
-                <w:szCs w:val="12"/>
+                <w:sz w:val="14"/>
+                <w:szCs w:val="14"/>
               </w:rPr>
               <w:t xml:space="preserve">Say what happens</w:t>
             </w:r>
@@ -317,18 +407,19 @@
         </w:tc>
         <w:tc>
           <w:tcPr>
-            <w:tcW w:type="dxa" w:w="7596"/>
-            <w:tcBorders>
-              <w:top w:val="single" w:color="C9BFAE" w:sz="2"/>
-              <w:left w:val="single" w:color="C9BFAE" w:sz="2"/>
-              <w:bottom w:val="single" w:color="C9BFAE" w:sz="2"/>
-              <w:right w:val="single" w:color="C9BFAE" w:sz="2"/>
-            </w:tcBorders>
-            <w:tcMar>
-              <w:top w:type="dxa" w:w="30"/>
-              <w:left w:type="dxa" w:w="70"/>
-              <w:bottom w:type="dxa" w:w="30"/>
-              <w:right w:type="dxa" w:w="70"/>
+            <w:tcW w:type="dxa" w:w="7196"/>
+            <w:tcBorders>
+              <w:top w:val="single" w:color="9C9382" w:sz="4"/>
+              <w:left w:val="single" w:color="9C9382" w:sz="4"/>
+              <w:bottom w:val="single" w:color="9C9382" w:sz="4"/>
+              <w:right w:val="single" w:color="9C9382" w:sz="4"/>
+            </w:tcBorders>
+            <w:shd w:fill="F4EFE5" w:color="auto" w:val="clear"/>
+            <w:tcMar>
+              <w:top w:type="dxa" w:w="70"/>
+              <w:left w:type="dxa" w:w="110"/>
+              <w:bottom w:type="dxa" w:w="70"/>
+              <w:right w:type="dxa" w:w="110"/>
             </w:tcMar>
             <w:vAlign w:val="center"/>
           </w:tcPr>
@@ -337,8 +428,8 @@
               <w:rPr>
                 <w:rFonts w:ascii="Calibri" w:cs="Calibri" w:eastAsia="Calibri" w:hAnsi="Calibri"/>
                 <w:color w:val="1E211F"/>
-                <w:sz w:val="12"/>
-                <w:szCs w:val="12"/>
+                <w:sz w:val="14"/>
+                <w:szCs w:val="14"/>
               </w:rPr>
               <w:t xml:space="preserve">I can identify parts of the story that relate to </w:t>
             </w:r>
@@ -348,8 +439,8 @@
                 <w:b/>
                 <w:bCs/>
                 <w:color w:val="0B447C"/>
-                <w:sz w:val="12"/>
-                <w:szCs w:val="12"/>
+                <w:sz w:val="14"/>
+                <w:szCs w:val="14"/>
                 <w:shd w:fill="D6EAFC" w:val="clear"/>
               </w:rPr>
               <w:t xml:space="preserve">key ideas</w:t>
@@ -360,19 +451,19 @@
       <w:tr>
         <w:tc>
           <w:tcPr>
-            <w:tcW w:type="dxa" w:w="600"/>
-            <w:tcBorders>
-              <w:top w:val="single" w:color="C9BFAE" w:sz="2"/>
-              <w:left w:val="single" w:color="C9BFAE" w:sz="2"/>
-              <w:bottom w:val="single" w:color="C9BFAE" w:sz="2"/>
-              <w:right w:val="single" w:color="C9BFAE" w:sz="2"/>
-            </w:tcBorders>
-            <w:shd w:fill="F4EFE5" w:color="auto" w:val="clear"/>
-            <w:tcMar>
-              <w:top w:type="dxa" w:w="30"/>
-              <w:left w:type="dxa" w:w="70"/>
-              <w:bottom w:type="dxa" w:w="30"/>
-              <w:right w:type="dxa" w:w="70"/>
+            <w:tcW w:type="dxa" w:w="750"/>
+            <w:tcBorders>
+              <w:top w:val="single" w:color="9C9382" w:sz="4"/>
+              <w:left w:val="single" w:color="9C9382" w:sz="4"/>
+              <w:bottom w:val="single" w:color="9C9382" w:sz="4"/>
+              <w:right w:val="single" w:color="9C9382" w:sz="4"/>
+            </w:tcBorders>
+            <w:shd w:fill="FFFFFF" w:color="auto" w:val="clear"/>
+            <w:tcMar>
+              <w:top w:type="dxa" w:w="70"/>
+              <w:left w:type="dxa" w:w="110"/>
+              <w:bottom w:type="dxa" w:w="70"/>
+              <w:right w:type="dxa" w:w="110"/>
             </w:tcMar>
             <w:vAlign w:val="center"/>
           </w:tcPr>
@@ -386,8 +477,8 @@
                 <w:b/>
                 <w:bCs/>
                 <w:color w:val="1D3C34"/>
-                <w:sz w:val="14"/>
-                <w:szCs w:val="14"/>
+                <w:sz w:val="18"/>
+                <w:szCs w:val="18"/>
               </w:rPr>
               <w:t xml:space="preserve">6</w:t>
             </w:r>
@@ -395,18 +486,19 @@
         </w:tc>
         <w:tc>
           <w:tcPr>
-            <w:tcW w:type="dxa" w:w="1550"/>
-            <w:tcBorders>
-              <w:top w:val="single" w:color="C9BFAE" w:sz="2"/>
-              <w:left w:val="single" w:color="C9BFAE" w:sz="2"/>
-              <w:bottom w:val="single" w:color="C9BFAE" w:sz="2"/>
-              <w:right w:val="single" w:color="C9BFAE" w:sz="2"/>
-            </w:tcBorders>
-            <w:tcMar>
-              <w:top w:type="dxa" w:w="30"/>
-              <w:left w:type="dxa" w:w="70"/>
-              <w:bottom w:type="dxa" w:w="30"/>
-              <w:right w:type="dxa" w:w="70"/>
+            <w:tcW w:type="dxa" w:w="1800"/>
+            <w:tcBorders>
+              <w:top w:val="single" w:color="9C9382" w:sz="4"/>
+              <w:left w:val="single" w:color="9C9382" w:sz="4"/>
+              <w:bottom w:val="single" w:color="9C9382" w:sz="4"/>
+              <w:right w:val="single" w:color="9C9382" w:sz="4"/>
+            </w:tcBorders>
+            <w:shd w:fill="FFFFFF" w:color="auto" w:val="clear"/>
+            <w:tcMar>
+              <w:top w:type="dxa" w:w="70"/>
+              <w:left w:type="dxa" w:w="110"/>
+              <w:bottom w:type="dxa" w:w="70"/>
+              <w:right w:type="dxa" w:w="110"/>
             </w:tcMar>
             <w:vAlign w:val="center"/>
           </w:tcPr>
@@ -417,8 +509,8 @@
                 <w:b/>
                 <w:bCs/>
                 <w:color w:val="1E211F"/>
-                <w:sz w:val="12"/>
-                <w:szCs w:val="12"/>
+                <w:sz w:val="14"/>
+                <w:szCs w:val="14"/>
               </w:rPr>
               <w:t xml:space="preserve">Describe it, with evidence</w:t>
             </w:r>
@@ -426,18 +518,19 @@
         </w:tc>
         <w:tc>
           <w:tcPr>
-            <w:tcW w:type="dxa" w:w="7596"/>
-            <w:tcBorders>
-              <w:top w:val="single" w:color="C9BFAE" w:sz="2"/>
-              <w:left w:val="single" w:color="C9BFAE" w:sz="2"/>
-              <w:bottom w:val="single" w:color="C9BFAE" w:sz="2"/>
-              <w:right w:val="single" w:color="C9BFAE" w:sz="2"/>
-            </w:tcBorders>
-            <w:tcMar>
-              <w:top w:type="dxa" w:w="30"/>
-              <w:left w:type="dxa" w:w="70"/>
-              <w:bottom w:type="dxa" w:w="30"/>
-              <w:right w:type="dxa" w:w="70"/>
+            <w:tcW w:type="dxa" w:w="7196"/>
+            <w:tcBorders>
+              <w:top w:val="single" w:color="9C9382" w:sz="4"/>
+              <w:left w:val="single" w:color="9C9382" w:sz="4"/>
+              <w:bottom w:val="single" w:color="9C9382" w:sz="4"/>
+              <w:right w:val="single" w:color="9C9382" w:sz="4"/>
+            </w:tcBorders>
+            <w:shd w:fill="FFFFFF" w:color="auto" w:val="clear"/>
+            <w:tcMar>
+              <w:top w:type="dxa" w:w="70"/>
+              <w:left w:type="dxa" w:w="110"/>
+              <w:bottom w:type="dxa" w:w="70"/>
+              <w:right w:type="dxa" w:w="110"/>
             </w:tcMar>
             <w:vAlign w:val="center"/>
           </w:tcPr>
@@ -446,8 +539,8 @@
               <w:rPr>
                 <w:rFonts w:ascii="Calibri" w:cs="Calibri" w:eastAsia="Calibri" w:hAnsi="Calibri"/>
                 <w:color w:val="1E211F"/>
-                <w:sz w:val="12"/>
-                <w:szCs w:val="12"/>
+                <w:sz w:val="14"/>
+                <w:szCs w:val="14"/>
               </w:rPr>
               <w:t xml:space="preserve">I can </w:t>
             </w:r>
@@ -457,8 +550,8 @@
                 <w:b/>
                 <w:bCs/>
                 <w:color w:val="7A5A00"/>
-                <w:sz w:val="12"/>
-                <w:szCs w:val="12"/>
+                <w:sz w:val="14"/>
+                <w:szCs w:val="14"/>
                 <w:shd w:fill="FFF3B0" w:val="clear"/>
               </w:rPr>
               <w:t xml:space="preserve">describe characters and events</w:t>
@@ -467,8 +560,8 @@
               <w:rPr>
                 <w:rFonts w:ascii="Calibri" w:cs="Calibri" w:eastAsia="Calibri" w:hAnsi="Calibri"/>
                 <w:color w:val="1E211F"/>
-                <w:sz w:val="12"/>
-                <w:szCs w:val="12"/>
+                <w:sz w:val="14"/>
+                <w:szCs w:val="14"/>
               </w:rPr>
               <w:t xml:space="preserve"> that relate to </w:t>
             </w:r>
@@ -478,8 +571,8 @@
                 <w:b/>
                 <w:bCs/>
                 <w:color w:val="0B447C"/>
-                <w:sz w:val="12"/>
-                <w:szCs w:val="12"/>
+                <w:sz w:val="14"/>
+                <w:szCs w:val="14"/>
                 <w:shd w:fill="D6EAFC" w:val="clear"/>
               </w:rPr>
               <w:t xml:space="preserve">key ideas</w:t>
@@ -490,19 +583,19 @@
       <w:tr>
         <w:tc>
           <w:tcPr>
-            <w:tcW w:type="dxa" w:w="600"/>
-            <w:tcBorders>
-              <w:top w:val="single" w:color="C9BFAE" w:sz="2"/>
-              <w:left w:val="single" w:color="C9BFAE" w:sz="2"/>
-              <w:bottom w:val="single" w:color="C9BFAE" w:sz="2"/>
-              <w:right w:val="single" w:color="C9BFAE" w:sz="2"/>
+            <w:tcW w:type="dxa" w:w="750"/>
+            <w:tcBorders>
+              <w:top w:val="single" w:color="9C9382" w:sz="4"/>
+              <w:left w:val="single" w:color="9C9382" w:sz="4"/>
+              <w:bottom w:val="single" w:color="9C9382" w:sz="4"/>
+              <w:right w:val="single" w:color="9C9382" w:sz="4"/>
             </w:tcBorders>
             <w:shd w:fill="F4EFE5" w:color="auto" w:val="clear"/>
             <w:tcMar>
-              <w:top w:type="dxa" w:w="30"/>
-              <w:left w:type="dxa" w:w="70"/>
-              <w:bottom w:type="dxa" w:w="30"/>
-              <w:right w:type="dxa" w:w="70"/>
+              <w:top w:type="dxa" w:w="70"/>
+              <w:left w:type="dxa" w:w="110"/>
+              <w:bottom w:type="dxa" w:w="70"/>
+              <w:right w:type="dxa" w:w="110"/>
             </w:tcMar>
             <w:vAlign w:val="center"/>
           </w:tcPr>
@@ -516,8 +609,8 @@
                 <w:b/>
                 <w:bCs/>
                 <w:color w:val="1D3C34"/>
-                <w:sz w:val="14"/>
-                <w:szCs w:val="14"/>
+                <w:sz w:val="18"/>
+                <w:szCs w:val="18"/>
               </w:rPr>
               <w:t xml:space="preserve">7</w:t>
             </w:r>
@@ -525,18 +618,19 @@
         </w:tc>
         <w:tc>
           <w:tcPr>
-            <w:tcW w:type="dxa" w:w="1550"/>
-            <w:tcBorders>
-              <w:top w:val="single" w:color="C9BFAE" w:sz="2"/>
-              <w:left w:val="single" w:color="C9BFAE" w:sz="2"/>
-              <w:bottom w:val="single" w:color="C9BFAE" w:sz="2"/>
-              <w:right w:val="single" w:color="C9BFAE" w:sz="2"/>
-            </w:tcBorders>
-            <w:tcMar>
-              <w:top w:type="dxa" w:w="30"/>
-              <w:left w:type="dxa" w:w="70"/>
-              <w:bottom w:type="dxa" w:w="30"/>
-              <w:right w:type="dxa" w:w="70"/>
+            <w:tcW w:type="dxa" w:w="1800"/>
+            <w:tcBorders>
+              <w:top w:val="single" w:color="9C9382" w:sz="4"/>
+              <w:left w:val="single" w:color="9C9382" w:sz="4"/>
+              <w:bottom w:val="single" w:color="9C9382" w:sz="4"/>
+              <w:right w:val="single" w:color="9C9382" w:sz="4"/>
+            </w:tcBorders>
+            <w:shd w:fill="F4EFE5" w:color="auto" w:val="clear"/>
+            <w:tcMar>
+              <w:top w:type="dxa" w:w="70"/>
+              <w:left w:type="dxa" w:w="110"/>
+              <w:bottom w:type="dxa" w:w="70"/>
+              <w:right w:type="dxa" w:w="110"/>
             </w:tcMar>
             <w:vAlign w:val="center"/>
           </w:tcPr>
@@ -547,8 +641,8 @@
                 <w:b/>
                 <w:bCs/>
                 <w:color w:val="1E211F"/>
-                <w:sz w:val="12"/>
-                <w:szCs w:val="12"/>
+                <w:sz w:val="14"/>
+                <w:szCs w:val="14"/>
               </w:rPr>
               <w:t xml:space="preserve">Explain the effect</w:t>
             </w:r>
@@ -556,18 +650,19 @@
         </w:tc>
         <w:tc>
           <w:tcPr>
-            <w:tcW w:type="dxa" w:w="7596"/>
-            <w:tcBorders>
-              <w:top w:val="single" w:color="C9BFAE" w:sz="2"/>
-              <w:left w:val="single" w:color="C9BFAE" w:sz="2"/>
-              <w:bottom w:val="single" w:color="C9BFAE" w:sz="2"/>
-              <w:right w:val="single" w:color="C9BFAE" w:sz="2"/>
-            </w:tcBorders>
-            <w:tcMar>
-              <w:top w:type="dxa" w:w="30"/>
-              <w:left w:type="dxa" w:w="70"/>
-              <w:bottom w:type="dxa" w:w="30"/>
-              <w:right w:type="dxa" w:w="70"/>
+            <w:tcW w:type="dxa" w:w="7196"/>
+            <w:tcBorders>
+              <w:top w:val="single" w:color="9C9382" w:sz="4"/>
+              <w:left w:val="single" w:color="9C9382" w:sz="4"/>
+              <w:bottom w:val="single" w:color="9C9382" w:sz="4"/>
+              <w:right w:val="single" w:color="9C9382" w:sz="4"/>
+            </w:tcBorders>
+            <w:shd w:fill="F4EFE5" w:color="auto" w:val="clear"/>
+            <w:tcMar>
+              <w:top w:type="dxa" w:w="70"/>
+              <w:left w:type="dxa" w:w="110"/>
+              <w:bottom w:type="dxa" w:w="70"/>
+              <w:right w:type="dxa" w:w="110"/>
             </w:tcMar>
             <w:vAlign w:val="center"/>
           </w:tcPr>
@@ -576,8 +671,8 @@
               <w:rPr>
                 <w:rFonts w:ascii="Calibri" w:cs="Calibri" w:eastAsia="Calibri" w:hAnsi="Calibri"/>
                 <w:color w:val="1E211F"/>
-                <w:sz w:val="12"/>
-                <w:szCs w:val="12"/>
+                <w:sz w:val="14"/>
+                <w:szCs w:val="14"/>
               </w:rPr>
               <w:t xml:space="preserve">I can describe the </w:t>
             </w:r>
@@ -587,8 +682,8 @@
                 <w:b/>
                 <w:bCs/>
                 <w:color w:val="0B447C"/>
-                <w:sz w:val="12"/>
-                <w:szCs w:val="12"/>
+                <w:sz w:val="14"/>
+                <w:szCs w:val="14"/>
                 <w:shd w:fill="D6EAFC" w:val="clear"/>
               </w:rPr>
               <w:t xml:space="preserve">ideas and issues that are illustrated</w:t>
@@ -597,8 +692,8 @@
               <w:rPr>
                 <w:rFonts w:ascii="Calibri" w:cs="Calibri" w:eastAsia="Calibri" w:hAnsi="Calibri"/>
                 <w:color w:val="1E211F"/>
-                <w:sz w:val="12"/>
-                <w:szCs w:val="12"/>
+                <w:sz w:val="14"/>
+                <w:szCs w:val="14"/>
               </w:rPr>
               <w:t xml:space="preserve"> through characters and events</w:t>
             </w:r>
@@ -608,19 +703,19 @@
       <w:tr>
         <w:tc>
           <w:tcPr>
-            <w:tcW w:type="dxa" w:w="600"/>
-            <w:tcBorders>
-              <w:top w:val="single" w:color="C9BFAE" w:sz="2"/>
-              <w:left w:val="single" w:color="C9BFAE" w:sz="2"/>
-              <w:bottom w:val="single" w:color="C9BFAE" w:sz="2"/>
-              <w:right w:val="single" w:color="C9BFAE" w:sz="2"/>
-            </w:tcBorders>
-            <w:shd w:fill="F4EFE5" w:color="auto" w:val="clear"/>
-            <w:tcMar>
-              <w:top w:type="dxa" w:w="30"/>
-              <w:left w:type="dxa" w:w="70"/>
-              <w:bottom w:type="dxa" w:w="30"/>
-              <w:right w:type="dxa" w:w="70"/>
+            <w:tcW w:type="dxa" w:w="750"/>
+            <w:tcBorders>
+              <w:top w:val="single" w:color="9C9382" w:sz="4"/>
+              <w:left w:val="single" w:color="9C9382" w:sz="4"/>
+              <w:bottom w:val="single" w:color="9C9382" w:sz="4"/>
+              <w:right w:val="single" w:color="9C9382" w:sz="4"/>
+            </w:tcBorders>
+            <w:shd w:fill="FFFFFF" w:color="auto" w:val="clear"/>
+            <w:tcMar>
+              <w:top w:type="dxa" w:w="70"/>
+              <w:left w:type="dxa" w:w="110"/>
+              <w:bottom w:type="dxa" w:w="70"/>
+              <w:right w:type="dxa" w:w="110"/>
             </w:tcMar>
             <w:vAlign w:val="center"/>
           </w:tcPr>
@@ -634,8 +729,8 @@
                 <w:b/>
                 <w:bCs/>
                 <w:color w:val="1D3C34"/>
-                <w:sz w:val="14"/>
-                <w:szCs w:val="14"/>
+                <w:sz w:val="18"/>
+                <w:szCs w:val="18"/>
               </w:rPr>
               <w:t xml:space="preserve">8</w:t>
             </w:r>
@@ -643,18 +738,19 @@
         </w:tc>
         <w:tc>
           <w:tcPr>
-            <w:tcW w:type="dxa" w:w="1550"/>
-            <w:tcBorders>
-              <w:top w:val="single" w:color="C9BFAE" w:sz="2"/>
-              <w:left w:val="single" w:color="C9BFAE" w:sz="2"/>
-              <w:bottom w:val="single" w:color="C9BFAE" w:sz="2"/>
-              <w:right w:val="single" w:color="C9BFAE" w:sz="2"/>
-            </w:tcBorders>
-            <w:tcMar>
-              <w:top w:type="dxa" w:w="30"/>
-              <w:left w:type="dxa" w:w="70"/>
-              <w:bottom w:type="dxa" w:w="30"/>
-              <w:right w:type="dxa" w:w="70"/>
+            <w:tcW w:type="dxa" w:w="1800"/>
+            <w:tcBorders>
+              <w:top w:val="single" w:color="9C9382" w:sz="4"/>
+              <w:left w:val="single" w:color="9C9382" w:sz="4"/>
+              <w:bottom w:val="single" w:color="9C9382" w:sz="4"/>
+              <w:right w:val="single" w:color="9C9382" w:sz="4"/>
+            </w:tcBorders>
+            <w:shd w:fill="FFFFFF" w:color="auto" w:val="clear"/>
+            <w:tcMar>
+              <w:top w:type="dxa" w:w="70"/>
+              <w:left w:type="dxa" w:w="110"/>
+              <w:bottom w:type="dxa" w:w="70"/>
+              <w:right w:type="dxa" w:w="110"/>
             </w:tcMar>
             <w:vAlign w:val="center"/>
           </w:tcPr>
@@ -665,8 +761,8 @@
                 <w:b/>
                 <w:bCs/>
                 <w:color w:val="1E211F"/>
-                <w:sz w:val="12"/>
-                <w:szCs w:val="12"/>
+                <w:sz w:val="14"/>
+                <w:szCs w:val="14"/>
               </w:rPr>
               <w:t xml:space="preserve">Analyse the choice</w:t>
             </w:r>
@@ -674,18 +770,19 @@
         </w:tc>
         <w:tc>
           <w:tcPr>
-            <w:tcW w:type="dxa" w:w="7596"/>
-            <w:tcBorders>
-              <w:top w:val="single" w:color="C9BFAE" w:sz="2"/>
-              <w:left w:val="single" w:color="C9BFAE" w:sz="2"/>
-              <w:bottom w:val="single" w:color="C9BFAE" w:sz="2"/>
-              <w:right w:val="single" w:color="C9BFAE" w:sz="2"/>
-            </w:tcBorders>
-            <w:tcMar>
-              <w:top w:type="dxa" w:w="30"/>
-              <w:left w:type="dxa" w:w="70"/>
-              <w:bottom w:type="dxa" w:w="30"/>
-              <w:right w:type="dxa" w:w="70"/>
+            <w:tcW w:type="dxa" w:w="7196"/>
+            <w:tcBorders>
+              <w:top w:val="single" w:color="9C9382" w:sz="4"/>
+              <w:left w:val="single" w:color="9C9382" w:sz="4"/>
+              <w:bottom w:val="single" w:color="9C9382" w:sz="4"/>
+              <w:right w:val="single" w:color="9C9382" w:sz="4"/>
+            </w:tcBorders>
+            <w:shd w:fill="FFFFFF" w:color="auto" w:val="clear"/>
+            <w:tcMar>
+              <w:top w:type="dxa" w:w="70"/>
+              <w:left w:type="dxa" w:w="110"/>
+              <w:bottom w:type="dxa" w:w="70"/>
+              <w:right w:type="dxa" w:w="110"/>
             </w:tcMar>
             <w:vAlign w:val="center"/>
           </w:tcPr>
@@ -694,8 +791,8 @@
               <w:rPr>
                 <w:rFonts w:ascii="Calibri" w:cs="Calibri" w:eastAsia="Calibri" w:hAnsi="Calibri"/>
                 <w:color w:val="1E211F"/>
-                <w:sz w:val="12"/>
-                <w:szCs w:val="12"/>
+                <w:sz w:val="14"/>
+                <w:szCs w:val="14"/>
               </w:rPr>
               <w:t xml:space="preserve">I can explain the way </w:t>
             </w:r>
@@ -705,8 +802,8 @@
                 <w:b/>
                 <w:bCs/>
                 <w:color w:val="0B447C"/>
-                <w:sz w:val="12"/>
-                <w:szCs w:val="12"/>
+                <w:sz w:val="14"/>
+                <w:szCs w:val="14"/>
                 <w:shd w:fill="D6EAFC" w:val="clear"/>
               </w:rPr>
               <w:t xml:space="preserve">different perspectives</w:t>
@@ -715,8 +812,8 @@
               <w:rPr>
                 <w:rFonts w:ascii="Calibri" w:cs="Calibri" w:eastAsia="Calibri" w:hAnsi="Calibri"/>
                 <w:color w:val="1E211F"/>
-                <w:sz w:val="12"/>
-                <w:szCs w:val="12"/>
+                <w:sz w:val="14"/>
+                <w:szCs w:val="14"/>
               </w:rPr>
               <w:t xml:space="preserve"> on ideas are represented through characters and events</w:t>
             </w:r>
@@ -726,19 +823,19 @@
       <w:tr>
         <w:tc>
           <w:tcPr>
-            <w:tcW w:type="dxa" w:w="600"/>
-            <w:tcBorders>
-              <w:top w:val="single" w:color="C9BFAE" w:sz="2"/>
-              <w:left w:val="single" w:color="C9BFAE" w:sz="2"/>
-              <w:bottom w:val="single" w:color="C9BFAE" w:sz="2"/>
-              <w:right w:val="single" w:color="C9BFAE" w:sz="2"/>
+            <w:tcW w:type="dxa" w:w="750"/>
+            <w:tcBorders>
+              <w:top w:val="single" w:color="9C9382" w:sz="4"/>
+              <w:left w:val="single" w:color="9C9382" w:sz="4"/>
+              <w:bottom w:val="single" w:color="9C9382" w:sz="4"/>
+              <w:right w:val="single" w:color="9C9382" w:sz="4"/>
             </w:tcBorders>
             <w:shd w:fill="F4EFE5" w:color="auto" w:val="clear"/>
             <w:tcMar>
-              <w:top w:type="dxa" w:w="30"/>
-              <w:left w:type="dxa" w:w="70"/>
-              <w:bottom w:type="dxa" w:w="30"/>
-              <w:right w:type="dxa" w:w="70"/>
+              <w:top w:type="dxa" w:w="70"/>
+              <w:left w:type="dxa" w:w="110"/>
+              <w:bottom w:type="dxa" w:w="70"/>
+              <w:right w:type="dxa" w:w="110"/>
             </w:tcMar>
             <w:vAlign w:val="center"/>
           </w:tcPr>
@@ -752,8 +849,8 @@
                 <w:b/>
                 <w:bCs/>
                 <w:color w:val="1D3C34"/>
-                <w:sz w:val="14"/>
-                <w:szCs w:val="14"/>
+                <w:sz w:val="18"/>
+                <w:szCs w:val="18"/>
               </w:rPr>
               <w:t xml:space="preserve">9</w:t>
             </w:r>
@@ -761,18 +858,19 @@
         </w:tc>
         <w:tc>
           <w:tcPr>
-            <w:tcW w:type="dxa" w:w="1550"/>
-            <w:tcBorders>
-              <w:top w:val="single" w:color="C9BFAE" w:sz="2"/>
-              <w:left w:val="single" w:color="C9BFAE" w:sz="2"/>
-              <w:bottom w:val="single" w:color="C9BFAE" w:sz="2"/>
-              <w:right w:val="single" w:color="C9BFAE" w:sz="2"/>
-            </w:tcBorders>
-            <w:tcMar>
-              <w:top w:type="dxa" w:w="30"/>
-              <w:left w:type="dxa" w:w="70"/>
-              <w:bottom w:type="dxa" w:w="30"/>
-              <w:right w:type="dxa" w:w="70"/>
+            <w:tcW w:type="dxa" w:w="1800"/>
+            <w:tcBorders>
+              <w:top w:val="single" w:color="9C9382" w:sz="4"/>
+              <w:left w:val="single" w:color="9C9382" w:sz="4"/>
+              <w:bottom w:val="single" w:color="9C9382" w:sz="4"/>
+              <w:right w:val="single" w:color="9C9382" w:sz="4"/>
+            </w:tcBorders>
+            <w:shd w:fill="F4EFE5" w:color="auto" w:val="clear"/>
+            <w:tcMar>
+              <w:top w:type="dxa" w:w="70"/>
+              <w:left w:type="dxa" w:w="110"/>
+              <w:bottom w:type="dxa" w:w="70"/>
+              <w:right w:type="dxa" w:w="110"/>
             </w:tcMar>
             <w:vAlign w:val="center"/>
           </w:tcPr>
@@ -783,8 +881,8 @@
                 <w:b/>
                 <w:bCs/>
                 <w:color w:val="1E211F"/>
-                <w:sz w:val="12"/>
-                <w:szCs w:val="12"/>
+                <w:sz w:val="14"/>
+                <w:szCs w:val="14"/>
               </w:rPr>
               <w:t xml:space="preserve">Question the representation</w:t>
             </w:r>
@@ -792,18 +890,19 @@
         </w:tc>
         <w:tc>
           <w:tcPr>
-            <w:tcW w:type="dxa" w:w="7596"/>
-            <w:tcBorders>
-              <w:top w:val="single" w:color="C9BFAE" w:sz="2"/>
-              <w:left w:val="single" w:color="C9BFAE" w:sz="2"/>
-              <w:bottom w:val="single" w:color="C9BFAE" w:sz="2"/>
-              <w:right w:val="single" w:color="C9BFAE" w:sz="2"/>
-            </w:tcBorders>
-            <w:tcMar>
-              <w:top w:type="dxa" w:w="30"/>
-              <w:left w:type="dxa" w:w="70"/>
-              <w:bottom w:type="dxa" w:w="30"/>
-              <w:right w:type="dxa" w:w="70"/>
+            <w:tcW w:type="dxa" w:w="7196"/>
+            <w:tcBorders>
+              <w:top w:val="single" w:color="9C9382" w:sz="4"/>
+              <w:left w:val="single" w:color="9C9382" w:sz="4"/>
+              <w:bottom w:val="single" w:color="9C9382" w:sz="4"/>
+              <w:right w:val="single" w:color="9C9382" w:sz="4"/>
+            </w:tcBorders>
+            <w:shd w:fill="F4EFE5" w:color="auto" w:val="clear"/>
+            <w:tcMar>
+              <w:top w:type="dxa" w:w="70"/>
+              <w:left w:type="dxa" w:w="110"/>
+              <w:bottom w:type="dxa" w:w="70"/>
+              <w:right w:type="dxa" w:w="110"/>
             </w:tcMar>
             <w:vAlign w:val="center"/>
           </w:tcPr>
@@ -812,8 +911,8 @@
               <w:rPr>
                 <w:rFonts w:ascii="Calibri" w:cs="Calibri" w:eastAsia="Calibri" w:hAnsi="Calibri"/>
                 <w:color w:val="1E211F"/>
-                <w:sz w:val="12"/>
-                <w:szCs w:val="12"/>
+                <w:sz w:val="14"/>
+                <w:szCs w:val="14"/>
               </w:rPr>
               <w:t xml:space="preserve">I can </w:t>
             </w:r>
@@ -823,8 +922,8 @@
                 <w:b/>
                 <w:bCs/>
                 <w:color w:val="8A4B12"/>
-                <w:sz w:val="12"/>
-                <w:szCs w:val="12"/>
+                <w:sz w:val="14"/>
+                <w:szCs w:val="14"/>
                 <w:shd w:fill="FAE3CF" w:val="clear"/>
               </w:rPr>
               <w:t xml:space="preserve">analyse</w:t>
@@ -833,8 +932,8 @@
               <w:rPr>
                 <w:rFonts w:ascii="Calibri" w:cs="Calibri" w:eastAsia="Calibri" w:hAnsi="Calibri"/>
                 <w:color w:val="1E211F"/>
-                <w:sz w:val="12"/>
-                <w:szCs w:val="12"/>
+                <w:sz w:val="14"/>
+                <w:szCs w:val="14"/>
               </w:rPr>
               <w:t xml:space="preserve"> the way different people and perspectives are </w:t>
             </w:r>
@@ -844,8 +943,8 @@
                 <w:b/>
                 <w:bCs/>
                 <w:color w:val="0B447C"/>
-                <w:sz w:val="12"/>
-                <w:szCs w:val="12"/>
+                <w:sz w:val="14"/>
+                <w:szCs w:val="14"/>
                 <w:shd w:fill="D6EAFC" w:val="clear"/>
               </w:rPr>
               <w:t xml:space="preserve">represented</w:t>
@@ -854,8 +953,8 @@
               <w:rPr>
                 <w:rFonts w:ascii="Calibri" w:cs="Calibri" w:eastAsia="Calibri" w:hAnsi="Calibri"/>
                 <w:color w:val="1E211F"/>
-                <w:sz w:val="12"/>
-                <w:szCs w:val="12"/>
+                <w:sz w:val="14"/>
+                <w:szCs w:val="14"/>
               </w:rPr>
               <w:t xml:space="preserve"> in the story</w:t>
             </w:r>
@@ -971,66 +1070,6 @@
           <w:szCs w:val="15"/>
         </w:rPr>
         <w:t xml:space="preserve">REWRITE</w:t>
-      </w:r>
-    </w:p>
-    <w:p>
-      <w:pPr>
-        <w:pBdr>
-          <w:bottom w:val="single" w:color="C9BFAE" w:sz="4" w:space="1"/>
-        </w:pBdr>
-        <w:spacing w:after="80" w:before="0" w:line="340"/>
-      </w:pPr>
-      <w:r>
-        <w:rPr>
-          <w:sz w:val="20"/>
-          <w:szCs w:val="20"/>
-        </w:rPr>
-        <w:t xml:space="preserve"/>
-      </w:r>
-    </w:p>
-    <w:p>
-      <w:pPr>
-        <w:pBdr>
-          <w:bottom w:val="single" w:color="C9BFAE" w:sz="4" w:space="1"/>
-        </w:pBdr>
-        <w:spacing w:after="80" w:before="0" w:line="340"/>
-      </w:pPr>
-      <w:r>
-        <w:rPr>
-          <w:sz w:val="20"/>
-          <w:szCs w:val="20"/>
-        </w:rPr>
-        <w:t xml:space="preserve"/>
-      </w:r>
-    </w:p>
-    <w:p>
-      <w:pPr>
-        <w:pBdr>
-          <w:bottom w:val="single" w:color="C9BFAE" w:sz="4" w:space="1"/>
-        </w:pBdr>
-        <w:spacing w:after="80" w:before="0" w:line="340"/>
-      </w:pPr>
-      <w:r>
-        <w:rPr>
-          <w:sz w:val="20"/>
-          <w:szCs w:val="20"/>
-        </w:rPr>
-        <w:t xml:space="preserve"/>
-      </w:r>
-    </w:p>
-    <w:p>
-      <w:pPr>
-        <w:pBdr>
-          <w:bottom w:val="single" w:color="C9BFAE" w:sz="4" w:space="1"/>
-        </w:pBdr>
-        <w:spacing w:after="80" w:before="0" w:line="340"/>
-      </w:pPr>
-      <w:r>
-        <w:rPr>
-          <w:sz w:val="20"/>
-          <w:szCs w:val="20"/>
-        </w:rPr>
-        <w:t xml:space="preserve"/>
       </w:r>
     </w:p>
     <w:p>

</xml_diff>

<commit_message>
Turn the rubric into a level-per-column grid
Levels across the top as columns, criteria down the side as rows — Skill
focus, then What you need to show — matching the orientation of the hub's
own rubric table, the wall and the A3 print sheets, instead of one
descriptor column with levels as rows. Six writing lines for the draft,
thirteen for the rewrite, using the vertical space the two-row grid frees up.
</commit_message>
<xml_diff>
--- a/BoneSparrow-draft-and-rewrite.docx
+++ b/BoneSparrow-draft-and-rewrite.docx
@@ -201,6 +201,21 @@
     </w:p>
     <w:p>
       <w:pPr>
+        <w:pBdr>
+          <w:bottom w:val="single" w:color="C9BFAE" w:sz="4" w:space="1"/>
+        </w:pBdr>
+        <w:spacing w:after="80" w:before="0" w:line="340"/>
+      </w:pPr>
+      <w:r>
+        <w:rPr>
+          <w:sz w:val="20"/>
+          <w:szCs w:val="20"/>
+        </w:rPr>
+        <w:t xml:space="preserve"/>
+      </w:r>
+    </w:p>
+    <w:p>
+      <w:pPr>
         <w:spacing w:after="40" w:before="90"/>
       </w:pPr>
       <w:r>
@@ -218,7 +233,7 @@
     </w:p>
     <w:tbl>
       <w:tblPr>
-        <w:tblW w:type="dxa" w:w="9746"/>
+        <w:tblW w:type="dxa" w:w="9745"/>
         <w:tblBorders>
           <w:top w:val="single" w:color="auto" w:sz="4"/>
           <w:left w:val="single" w:color="auto" w:sz="4"/>
@@ -229,9 +244,12 @@
         </w:tblBorders>
       </w:tblPr>
       <w:tblGrid>
-        <w:gridCol w:w="750"/>
-        <w:gridCol w:w="1800"/>
-        <w:gridCol w:w="7196"/>
+        <w:gridCol w:w="900"/>
+        <w:gridCol w:w="1769"/>
+        <w:gridCol w:w="1769"/>
+        <w:gridCol w:w="1769"/>
+        <w:gridCol w:w="1769"/>
+        <w:gridCol w:w="1769"/>
       </w:tblGrid>
       <w:tr>
         <w:trPr>
@@ -239,7 +257,7 @@
         </w:trPr>
         <w:tc>
           <w:tcPr>
-            <w:tcW w:type="dxa" w:w="750"/>
+            <w:tcW w:type="dxa" w:w="900"/>
             <w:tcBorders>
               <w:top w:val="single" w:color="9C9382" w:sz="4"/>
               <w:left w:val="single" w:color="9C9382" w:sz="4"/>
@@ -248,31 +266,18 @@
             </w:tcBorders>
             <w:shd w:fill="1D3C34" w:color="auto" w:val="clear"/>
             <w:tcMar>
-              <w:top w:type="dxa" w:w="70"/>
-              <w:left w:type="dxa" w:w="110"/>
-              <w:bottom w:type="dxa" w:w="70"/>
-              <w:right w:type="dxa" w:w="110"/>
-            </w:tcMar>
-            <w:vAlign w:val="center"/>
-          </w:tcPr>
-          <w:p>
-            <w:r>
-              <w:rPr>
-                <w:rFonts w:ascii="Calibri" w:cs="Calibri" w:eastAsia="Calibri" w:hAnsi="Calibri"/>
-                <w:b/>
-                <w:bCs/>
-                <w:color w:val="F6F1E6"/>
-                <w:spacing w:val="14"/>
-                <w:sz w:val="15"/>
-                <w:szCs w:val="15"/>
-              </w:rPr>
-              <w:t xml:space="preserve">Level</w:t>
-            </w:r>
-          </w:p>
-        </w:tc>
-        <w:tc>
-          <w:tcPr>
-            <w:tcW w:type="dxa" w:w="1800"/>
+              <w:top w:type="dxa" w:w="60"/>
+              <w:left w:type="dxa" w:w="80"/>
+              <w:bottom w:type="dxa" w:w="60"/>
+              <w:right w:type="dxa" w:w="80"/>
+            </w:tcMar>
+            <w:vAlign w:val="center"/>
+          </w:tcPr>
+          <w:p/>
+        </w:tc>
+        <w:tc>
+          <w:tcPr>
+            <w:tcW w:type="dxa" w:w="1769"/>
             <w:tcBorders>
               <w:top w:val="single" w:color="9C9382" w:sz="4"/>
               <w:left w:val="single" w:color="9C9382" w:sz="4"/>
@@ -281,78 +286,10 @@
             </w:tcBorders>
             <w:shd w:fill="1D3C34" w:color="auto" w:val="clear"/>
             <w:tcMar>
-              <w:top w:type="dxa" w:w="70"/>
-              <w:left w:type="dxa" w:w="110"/>
-              <w:bottom w:type="dxa" w:w="70"/>
-              <w:right w:type="dxa" w:w="110"/>
-            </w:tcMar>
-            <w:vAlign w:val="center"/>
-          </w:tcPr>
-          <w:p>
-            <w:r>
-              <w:rPr>
-                <w:rFonts w:ascii="Calibri" w:cs="Calibri" w:eastAsia="Calibri" w:hAnsi="Calibri"/>
-                <w:b/>
-                <w:bCs/>
-                <w:color w:val="F6F1E6"/>
-                <w:spacing w:val="14"/>
-                <w:sz w:val="15"/>
-                <w:szCs w:val="15"/>
-              </w:rPr>
-              <w:t xml:space="preserve">Focus</w:t>
-            </w:r>
-          </w:p>
-        </w:tc>
-        <w:tc>
-          <w:tcPr>
-            <w:tcW w:type="dxa" w:w="7196"/>
-            <w:tcBorders>
-              <w:top w:val="single" w:color="9C9382" w:sz="4"/>
-              <w:left w:val="single" w:color="9C9382" w:sz="4"/>
-              <w:bottom w:val="single" w:color="9C9382" w:sz="4"/>
-              <w:right w:val="single" w:color="9C9382" w:sz="4"/>
-            </w:tcBorders>
-            <w:shd w:fill="1D3C34" w:color="auto" w:val="clear"/>
-            <w:tcMar>
-              <w:top w:type="dxa" w:w="70"/>
-              <w:left w:type="dxa" w:w="110"/>
-              <w:bottom w:type="dxa" w:w="70"/>
-              <w:right w:type="dxa" w:w="110"/>
-            </w:tcMar>
-            <w:vAlign w:val="center"/>
-          </w:tcPr>
-          <w:p>
-            <w:r>
-              <w:rPr>
-                <w:rFonts w:ascii="Calibri" w:cs="Calibri" w:eastAsia="Calibri" w:hAnsi="Calibri"/>
-                <w:b/>
-                <w:bCs/>
-                <w:color w:val="F6F1E6"/>
-                <w:spacing w:val="14"/>
-                <w:sz w:val="15"/>
-                <w:szCs w:val="15"/>
-              </w:rPr>
-              <w:t xml:space="preserve">What you need to show</w:t>
-            </w:r>
-          </w:p>
-        </w:tc>
-      </w:tr>
-      <w:tr>
-        <w:tc>
-          <w:tcPr>
-            <w:tcW w:type="dxa" w:w="750"/>
-            <w:tcBorders>
-              <w:top w:val="single" w:color="9C9382" w:sz="4"/>
-              <w:left w:val="single" w:color="9C9382" w:sz="4"/>
-              <w:bottom w:val="single" w:color="9C9382" w:sz="4"/>
-              <w:right w:val="single" w:color="9C9382" w:sz="4"/>
-            </w:tcBorders>
-            <w:shd w:fill="F4EFE5" w:color="auto" w:val="clear"/>
-            <w:tcMar>
-              <w:top w:type="dxa" w:w="70"/>
-              <w:left w:type="dxa" w:w="110"/>
-              <w:bottom w:type="dxa" w:w="70"/>
-              <w:right w:type="dxa" w:w="110"/>
+              <w:top w:type="dxa" w:w="60"/>
+              <w:left w:type="dxa" w:w="80"/>
+              <w:bottom w:type="dxa" w:w="60"/>
+              <w:right w:type="dxa" w:w="80"/>
             </w:tcMar>
             <w:vAlign w:val="center"/>
           </w:tcPr>
@@ -365,105 +302,30 @@
                 <w:rFonts w:ascii="Calibri" w:cs="Calibri" w:eastAsia="Calibri" w:hAnsi="Calibri"/>
                 <w:b/>
                 <w:bCs/>
-                <w:color w:val="1D3C34"/>
-                <w:sz w:val="18"/>
-                <w:szCs w:val="18"/>
-              </w:rPr>
-              <w:t xml:space="preserve">5</w:t>
+                <w:color w:val="F6F1E6"/>
+                <w:spacing w:val="10"/>
+                <w:sz w:val="13"/>
+                <w:szCs w:val="13"/>
+              </w:rPr>
+              <w:t xml:space="preserve">LEVEL 5</w:t>
             </w:r>
           </w:p>
         </w:tc>
         <w:tc>
           <w:tcPr>
-            <w:tcW w:type="dxa" w:w="1800"/>
-            <w:tcBorders>
-              <w:top w:val="single" w:color="9C9382" w:sz="4"/>
-              <w:left w:val="single" w:color="9C9382" w:sz="4"/>
-              <w:bottom w:val="single" w:color="9C9382" w:sz="4"/>
-              <w:right w:val="single" w:color="9C9382" w:sz="4"/>
-            </w:tcBorders>
-            <w:shd w:fill="F4EFE5" w:color="auto" w:val="clear"/>
-            <w:tcMar>
-              <w:top w:type="dxa" w:w="70"/>
-              <w:left w:type="dxa" w:w="110"/>
-              <w:bottom w:type="dxa" w:w="70"/>
-              <w:right w:type="dxa" w:w="110"/>
-            </w:tcMar>
-            <w:vAlign w:val="center"/>
-          </w:tcPr>
-          <w:p>
-            <w:r>
-              <w:rPr>
-                <w:rFonts w:ascii="Calibri" w:cs="Calibri" w:eastAsia="Calibri" w:hAnsi="Calibri"/>
-                <w:b/>
-                <w:bCs/>
-                <w:color w:val="1E211F"/>
-                <w:sz w:val="14"/>
-                <w:szCs w:val="14"/>
-              </w:rPr>
-              <w:t xml:space="preserve">Say what happens</w:t>
-            </w:r>
-          </w:p>
-        </w:tc>
-        <w:tc>
-          <w:tcPr>
-            <w:tcW w:type="dxa" w:w="7196"/>
-            <w:tcBorders>
-              <w:top w:val="single" w:color="9C9382" w:sz="4"/>
-              <w:left w:val="single" w:color="9C9382" w:sz="4"/>
-              <w:bottom w:val="single" w:color="9C9382" w:sz="4"/>
-              <w:right w:val="single" w:color="9C9382" w:sz="4"/>
-            </w:tcBorders>
-            <w:shd w:fill="F4EFE5" w:color="auto" w:val="clear"/>
-            <w:tcMar>
-              <w:top w:type="dxa" w:w="70"/>
-              <w:left w:type="dxa" w:w="110"/>
-              <w:bottom w:type="dxa" w:w="70"/>
-              <w:right w:type="dxa" w:w="110"/>
-            </w:tcMar>
-            <w:vAlign w:val="center"/>
-          </w:tcPr>
-          <w:p>
-            <w:r>
-              <w:rPr>
-                <w:rFonts w:ascii="Calibri" w:cs="Calibri" w:eastAsia="Calibri" w:hAnsi="Calibri"/>
-                <w:color w:val="1E211F"/>
-                <w:sz w:val="14"/>
-                <w:szCs w:val="14"/>
-              </w:rPr>
-              <w:t xml:space="preserve">I can identify parts of the story that relate to </w:t>
-            </w:r>
-            <w:r>
-              <w:rPr>
-                <w:rFonts w:ascii="Calibri" w:cs="Calibri" w:eastAsia="Calibri" w:hAnsi="Calibri"/>
-                <w:b/>
-                <w:bCs/>
-                <w:color w:val="0B447C"/>
-                <w:sz w:val="14"/>
-                <w:szCs w:val="14"/>
-                <w:shd w:fill="D6EAFC" w:val="clear"/>
-              </w:rPr>
-              <w:t xml:space="preserve">key ideas</w:t>
-            </w:r>
-          </w:p>
-        </w:tc>
-      </w:tr>
-      <w:tr>
-        <w:tc>
-          <w:tcPr>
-            <w:tcW w:type="dxa" w:w="750"/>
-            <w:tcBorders>
-              <w:top w:val="single" w:color="9C9382" w:sz="4"/>
-              <w:left w:val="single" w:color="9C9382" w:sz="4"/>
-              <w:bottom w:val="single" w:color="9C9382" w:sz="4"/>
-              <w:right w:val="single" w:color="9C9382" w:sz="4"/>
-            </w:tcBorders>
-            <w:shd w:fill="FFFFFF" w:color="auto" w:val="clear"/>
-            <w:tcMar>
-              <w:top w:type="dxa" w:w="70"/>
-              <w:left w:type="dxa" w:w="110"/>
-              <w:bottom w:type="dxa" w:w="70"/>
-              <w:right w:type="dxa" w:w="110"/>
+            <w:tcW w:type="dxa" w:w="1769"/>
+            <w:tcBorders>
+              <w:top w:val="single" w:color="9C9382" w:sz="4"/>
+              <w:left w:val="single" w:color="9C9382" w:sz="4"/>
+              <w:bottom w:val="single" w:color="9C9382" w:sz="4"/>
+              <w:right w:val="single" w:color="9C9382" w:sz="4"/>
+            </w:tcBorders>
+            <w:shd w:fill="1D3C34" w:color="auto" w:val="clear"/>
+            <w:tcMar>
+              <w:top w:type="dxa" w:w="60"/>
+              <w:left w:type="dxa" w:w="80"/>
+              <w:bottom w:type="dxa" w:w="60"/>
+              <w:right w:type="dxa" w:w="80"/>
             </w:tcMar>
             <w:vAlign w:val="center"/>
           </w:tcPr>
@@ -476,126 +338,30 @@
                 <w:rFonts w:ascii="Calibri" w:cs="Calibri" w:eastAsia="Calibri" w:hAnsi="Calibri"/>
                 <w:b/>
                 <w:bCs/>
-                <w:color w:val="1D3C34"/>
-                <w:sz w:val="18"/>
-                <w:szCs w:val="18"/>
-              </w:rPr>
-              <w:t xml:space="preserve">6</w:t>
+                <w:color w:val="F6F1E6"/>
+                <w:spacing w:val="10"/>
+                <w:sz w:val="13"/>
+                <w:szCs w:val="13"/>
+              </w:rPr>
+              <w:t xml:space="preserve">LEVEL 6</w:t>
             </w:r>
           </w:p>
         </w:tc>
         <w:tc>
           <w:tcPr>
-            <w:tcW w:type="dxa" w:w="1800"/>
-            <w:tcBorders>
-              <w:top w:val="single" w:color="9C9382" w:sz="4"/>
-              <w:left w:val="single" w:color="9C9382" w:sz="4"/>
-              <w:bottom w:val="single" w:color="9C9382" w:sz="4"/>
-              <w:right w:val="single" w:color="9C9382" w:sz="4"/>
-            </w:tcBorders>
-            <w:shd w:fill="FFFFFF" w:color="auto" w:val="clear"/>
-            <w:tcMar>
-              <w:top w:type="dxa" w:w="70"/>
-              <w:left w:type="dxa" w:w="110"/>
-              <w:bottom w:type="dxa" w:w="70"/>
-              <w:right w:type="dxa" w:w="110"/>
-            </w:tcMar>
-            <w:vAlign w:val="center"/>
-          </w:tcPr>
-          <w:p>
-            <w:r>
-              <w:rPr>
-                <w:rFonts w:ascii="Calibri" w:cs="Calibri" w:eastAsia="Calibri" w:hAnsi="Calibri"/>
-                <w:b/>
-                <w:bCs/>
-                <w:color w:val="1E211F"/>
-                <w:sz w:val="14"/>
-                <w:szCs w:val="14"/>
-              </w:rPr>
-              <w:t xml:space="preserve">Describe it, with evidence</w:t>
-            </w:r>
-          </w:p>
-        </w:tc>
-        <w:tc>
-          <w:tcPr>
-            <w:tcW w:type="dxa" w:w="7196"/>
-            <w:tcBorders>
-              <w:top w:val="single" w:color="9C9382" w:sz="4"/>
-              <w:left w:val="single" w:color="9C9382" w:sz="4"/>
-              <w:bottom w:val="single" w:color="9C9382" w:sz="4"/>
-              <w:right w:val="single" w:color="9C9382" w:sz="4"/>
-            </w:tcBorders>
-            <w:shd w:fill="FFFFFF" w:color="auto" w:val="clear"/>
-            <w:tcMar>
-              <w:top w:type="dxa" w:w="70"/>
-              <w:left w:type="dxa" w:w="110"/>
-              <w:bottom w:type="dxa" w:w="70"/>
-              <w:right w:type="dxa" w:w="110"/>
-            </w:tcMar>
-            <w:vAlign w:val="center"/>
-          </w:tcPr>
-          <w:p>
-            <w:r>
-              <w:rPr>
-                <w:rFonts w:ascii="Calibri" w:cs="Calibri" w:eastAsia="Calibri" w:hAnsi="Calibri"/>
-                <w:color w:val="1E211F"/>
-                <w:sz w:val="14"/>
-                <w:szCs w:val="14"/>
-              </w:rPr>
-              <w:t xml:space="preserve">I can </w:t>
-            </w:r>
-            <w:r>
-              <w:rPr>
-                <w:rFonts w:ascii="Calibri" w:cs="Calibri" w:eastAsia="Calibri" w:hAnsi="Calibri"/>
-                <w:b/>
-                <w:bCs/>
-                <w:color w:val="7A5A00"/>
-                <w:sz w:val="14"/>
-                <w:szCs w:val="14"/>
-                <w:shd w:fill="FFF3B0" w:val="clear"/>
-              </w:rPr>
-              <w:t xml:space="preserve">describe characters and events</w:t>
-            </w:r>
-            <w:r>
-              <w:rPr>
-                <w:rFonts w:ascii="Calibri" w:cs="Calibri" w:eastAsia="Calibri" w:hAnsi="Calibri"/>
-                <w:color w:val="1E211F"/>
-                <w:sz w:val="14"/>
-                <w:szCs w:val="14"/>
-              </w:rPr>
-              <w:t xml:space="preserve"> that relate to </w:t>
-            </w:r>
-            <w:r>
-              <w:rPr>
-                <w:rFonts w:ascii="Calibri" w:cs="Calibri" w:eastAsia="Calibri" w:hAnsi="Calibri"/>
-                <w:b/>
-                <w:bCs/>
-                <w:color w:val="0B447C"/>
-                <w:sz w:val="14"/>
-                <w:szCs w:val="14"/>
-                <w:shd w:fill="D6EAFC" w:val="clear"/>
-              </w:rPr>
-              <w:t xml:space="preserve">key ideas</w:t>
-            </w:r>
-          </w:p>
-        </w:tc>
-      </w:tr>
-      <w:tr>
-        <w:tc>
-          <w:tcPr>
-            <w:tcW w:type="dxa" w:w="750"/>
-            <w:tcBorders>
-              <w:top w:val="single" w:color="9C9382" w:sz="4"/>
-              <w:left w:val="single" w:color="9C9382" w:sz="4"/>
-              <w:bottom w:val="single" w:color="9C9382" w:sz="4"/>
-              <w:right w:val="single" w:color="9C9382" w:sz="4"/>
-            </w:tcBorders>
-            <w:shd w:fill="F4EFE5" w:color="auto" w:val="clear"/>
-            <w:tcMar>
-              <w:top w:type="dxa" w:w="70"/>
-              <w:left w:type="dxa" w:w="110"/>
-              <w:bottom w:type="dxa" w:w="70"/>
-              <w:right w:type="dxa" w:w="110"/>
+            <w:tcW w:type="dxa" w:w="1769"/>
+            <w:tcBorders>
+              <w:top w:val="single" w:color="9C9382" w:sz="4"/>
+              <w:left w:val="single" w:color="9C9382" w:sz="4"/>
+              <w:bottom w:val="single" w:color="9C9382" w:sz="4"/>
+              <w:right w:val="single" w:color="9C9382" w:sz="4"/>
+            </w:tcBorders>
+            <w:shd w:fill="1D3C34" w:color="auto" w:val="clear"/>
+            <w:tcMar>
+              <w:top w:type="dxa" w:w="60"/>
+              <w:left w:type="dxa" w:w="80"/>
+              <w:bottom w:type="dxa" w:w="60"/>
+              <w:right w:type="dxa" w:w="80"/>
             </w:tcMar>
             <w:vAlign w:val="center"/>
           </w:tcPr>
@@ -608,114 +374,30 @@
                 <w:rFonts w:ascii="Calibri" w:cs="Calibri" w:eastAsia="Calibri" w:hAnsi="Calibri"/>
                 <w:b/>
                 <w:bCs/>
-                <w:color w:val="1D3C34"/>
-                <w:sz w:val="18"/>
-                <w:szCs w:val="18"/>
-              </w:rPr>
-              <w:t xml:space="preserve">7</w:t>
+                <w:color w:val="F6F1E6"/>
+                <w:spacing w:val="10"/>
+                <w:sz w:val="13"/>
+                <w:szCs w:val="13"/>
+              </w:rPr>
+              <w:t xml:space="preserve">LEVEL 7</w:t>
             </w:r>
           </w:p>
         </w:tc>
         <w:tc>
           <w:tcPr>
-            <w:tcW w:type="dxa" w:w="1800"/>
-            <w:tcBorders>
-              <w:top w:val="single" w:color="9C9382" w:sz="4"/>
-              <w:left w:val="single" w:color="9C9382" w:sz="4"/>
-              <w:bottom w:val="single" w:color="9C9382" w:sz="4"/>
-              <w:right w:val="single" w:color="9C9382" w:sz="4"/>
-            </w:tcBorders>
-            <w:shd w:fill="F4EFE5" w:color="auto" w:val="clear"/>
-            <w:tcMar>
-              <w:top w:type="dxa" w:w="70"/>
-              <w:left w:type="dxa" w:w="110"/>
-              <w:bottom w:type="dxa" w:w="70"/>
-              <w:right w:type="dxa" w:w="110"/>
-            </w:tcMar>
-            <w:vAlign w:val="center"/>
-          </w:tcPr>
-          <w:p>
-            <w:r>
-              <w:rPr>
-                <w:rFonts w:ascii="Calibri" w:cs="Calibri" w:eastAsia="Calibri" w:hAnsi="Calibri"/>
-                <w:b/>
-                <w:bCs/>
-                <w:color w:val="1E211F"/>
-                <w:sz w:val="14"/>
-                <w:szCs w:val="14"/>
-              </w:rPr>
-              <w:t xml:space="preserve">Explain the effect</w:t>
-            </w:r>
-          </w:p>
-        </w:tc>
-        <w:tc>
-          <w:tcPr>
-            <w:tcW w:type="dxa" w:w="7196"/>
-            <w:tcBorders>
-              <w:top w:val="single" w:color="9C9382" w:sz="4"/>
-              <w:left w:val="single" w:color="9C9382" w:sz="4"/>
-              <w:bottom w:val="single" w:color="9C9382" w:sz="4"/>
-              <w:right w:val="single" w:color="9C9382" w:sz="4"/>
-            </w:tcBorders>
-            <w:shd w:fill="F4EFE5" w:color="auto" w:val="clear"/>
-            <w:tcMar>
-              <w:top w:type="dxa" w:w="70"/>
-              <w:left w:type="dxa" w:w="110"/>
-              <w:bottom w:type="dxa" w:w="70"/>
-              <w:right w:type="dxa" w:w="110"/>
-            </w:tcMar>
-            <w:vAlign w:val="center"/>
-          </w:tcPr>
-          <w:p>
-            <w:r>
-              <w:rPr>
-                <w:rFonts w:ascii="Calibri" w:cs="Calibri" w:eastAsia="Calibri" w:hAnsi="Calibri"/>
-                <w:color w:val="1E211F"/>
-                <w:sz w:val="14"/>
-                <w:szCs w:val="14"/>
-              </w:rPr>
-              <w:t xml:space="preserve">I can describe the </w:t>
-            </w:r>
-            <w:r>
-              <w:rPr>
-                <w:rFonts w:ascii="Calibri" w:cs="Calibri" w:eastAsia="Calibri" w:hAnsi="Calibri"/>
-                <w:b/>
-                <w:bCs/>
-                <w:color w:val="0B447C"/>
-                <w:sz w:val="14"/>
-                <w:szCs w:val="14"/>
-                <w:shd w:fill="D6EAFC" w:val="clear"/>
-              </w:rPr>
-              <w:t xml:space="preserve">ideas and issues that are illustrated</w:t>
-            </w:r>
-            <w:r>
-              <w:rPr>
-                <w:rFonts w:ascii="Calibri" w:cs="Calibri" w:eastAsia="Calibri" w:hAnsi="Calibri"/>
-                <w:color w:val="1E211F"/>
-                <w:sz w:val="14"/>
-                <w:szCs w:val="14"/>
-              </w:rPr>
-              <w:t xml:space="preserve"> through characters and events</w:t>
-            </w:r>
-          </w:p>
-        </w:tc>
-      </w:tr>
-      <w:tr>
-        <w:tc>
-          <w:tcPr>
-            <w:tcW w:type="dxa" w:w="750"/>
-            <w:tcBorders>
-              <w:top w:val="single" w:color="9C9382" w:sz="4"/>
-              <w:left w:val="single" w:color="9C9382" w:sz="4"/>
-              <w:bottom w:val="single" w:color="9C9382" w:sz="4"/>
-              <w:right w:val="single" w:color="9C9382" w:sz="4"/>
-            </w:tcBorders>
-            <w:shd w:fill="FFFFFF" w:color="auto" w:val="clear"/>
-            <w:tcMar>
-              <w:top w:type="dxa" w:w="70"/>
-              <w:left w:type="dxa" w:w="110"/>
-              <w:bottom w:type="dxa" w:w="70"/>
-              <w:right w:type="dxa" w:w="110"/>
+            <w:tcW w:type="dxa" w:w="1769"/>
+            <w:tcBorders>
+              <w:top w:val="single" w:color="9C9382" w:sz="4"/>
+              <w:left w:val="single" w:color="9C9382" w:sz="4"/>
+              <w:bottom w:val="single" w:color="9C9382" w:sz="4"/>
+              <w:right w:val="single" w:color="9C9382" w:sz="4"/>
+            </w:tcBorders>
+            <w:shd w:fill="1D3C34" w:color="auto" w:val="clear"/>
+            <w:tcMar>
+              <w:top w:type="dxa" w:w="60"/>
+              <w:left w:type="dxa" w:w="80"/>
+              <w:bottom w:type="dxa" w:w="60"/>
+              <w:right w:type="dxa" w:w="80"/>
             </w:tcMar>
             <w:vAlign w:val="center"/>
           </w:tcPr>
@@ -728,114 +410,30 @@
                 <w:rFonts w:ascii="Calibri" w:cs="Calibri" w:eastAsia="Calibri" w:hAnsi="Calibri"/>
                 <w:b/>
                 <w:bCs/>
-                <w:color w:val="1D3C34"/>
-                <w:sz w:val="18"/>
-                <w:szCs w:val="18"/>
-              </w:rPr>
-              <w:t xml:space="preserve">8</w:t>
+                <w:color w:val="F6F1E6"/>
+                <w:spacing w:val="10"/>
+                <w:sz w:val="13"/>
+                <w:szCs w:val="13"/>
+              </w:rPr>
+              <w:t xml:space="preserve">LEVEL 8</w:t>
             </w:r>
           </w:p>
         </w:tc>
         <w:tc>
           <w:tcPr>
-            <w:tcW w:type="dxa" w:w="1800"/>
-            <w:tcBorders>
-              <w:top w:val="single" w:color="9C9382" w:sz="4"/>
-              <w:left w:val="single" w:color="9C9382" w:sz="4"/>
-              <w:bottom w:val="single" w:color="9C9382" w:sz="4"/>
-              <w:right w:val="single" w:color="9C9382" w:sz="4"/>
-            </w:tcBorders>
-            <w:shd w:fill="FFFFFF" w:color="auto" w:val="clear"/>
-            <w:tcMar>
-              <w:top w:type="dxa" w:w="70"/>
-              <w:left w:type="dxa" w:w="110"/>
-              <w:bottom w:type="dxa" w:w="70"/>
-              <w:right w:type="dxa" w:w="110"/>
-            </w:tcMar>
-            <w:vAlign w:val="center"/>
-          </w:tcPr>
-          <w:p>
-            <w:r>
-              <w:rPr>
-                <w:rFonts w:ascii="Calibri" w:cs="Calibri" w:eastAsia="Calibri" w:hAnsi="Calibri"/>
-                <w:b/>
-                <w:bCs/>
-                <w:color w:val="1E211F"/>
-                <w:sz w:val="14"/>
-                <w:szCs w:val="14"/>
-              </w:rPr>
-              <w:t xml:space="preserve">Analyse the choice</w:t>
-            </w:r>
-          </w:p>
-        </w:tc>
-        <w:tc>
-          <w:tcPr>
-            <w:tcW w:type="dxa" w:w="7196"/>
-            <w:tcBorders>
-              <w:top w:val="single" w:color="9C9382" w:sz="4"/>
-              <w:left w:val="single" w:color="9C9382" w:sz="4"/>
-              <w:bottom w:val="single" w:color="9C9382" w:sz="4"/>
-              <w:right w:val="single" w:color="9C9382" w:sz="4"/>
-            </w:tcBorders>
-            <w:shd w:fill="FFFFFF" w:color="auto" w:val="clear"/>
-            <w:tcMar>
-              <w:top w:type="dxa" w:w="70"/>
-              <w:left w:type="dxa" w:w="110"/>
-              <w:bottom w:type="dxa" w:w="70"/>
-              <w:right w:type="dxa" w:w="110"/>
-            </w:tcMar>
-            <w:vAlign w:val="center"/>
-          </w:tcPr>
-          <w:p>
-            <w:r>
-              <w:rPr>
-                <w:rFonts w:ascii="Calibri" w:cs="Calibri" w:eastAsia="Calibri" w:hAnsi="Calibri"/>
-                <w:color w:val="1E211F"/>
-                <w:sz w:val="14"/>
-                <w:szCs w:val="14"/>
-              </w:rPr>
-              <w:t xml:space="preserve">I can explain the way </w:t>
-            </w:r>
-            <w:r>
-              <w:rPr>
-                <w:rFonts w:ascii="Calibri" w:cs="Calibri" w:eastAsia="Calibri" w:hAnsi="Calibri"/>
-                <w:b/>
-                <w:bCs/>
-                <w:color w:val="0B447C"/>
-                <w:sz w:val="14"/>
-                <w:szCs w:val="14"/>
-                <w:shd w:fill="D6EAFC" w:val="clear"/>
-              </w:rPr>
-              <w:t xml:space="preserve">different perspectives</w:t>
-            </w:r>
-            <w:r>
-              <w:rPr>
-                <w:rFonts w:ascii="Calibri" w:cs="Calibri" w:eastAsia="Calibri" w:hAnsi="Calibri"/>
-                <w:color w:val="1E211F"/>
-                <w:sz w:val="14"/>
-                <w:szCs w:val="14"/>
-              </w:rPr>
-              <w:t xml:space="preserve"> on ideas are represented through characters and events</w:t>
-            </w:r>
-          </w:p>
-        </w:tc>
-      </w:tr>
-      <w:tr>
-        <w:tc>
-          <w:tcPr>
-            <w:tcW w:type="dxa" w:w="750"/>
-            <w:tcBorders>
-              <w:top w:val="single" w:color="9C9382" w:sz="4"/>
-              <w:left w:val="single" w:color="9C9382" w:sz="4"/>
-              <w:bottom w:val="single" w:color="9C9382" w:sz="4"/>
-              <w:right w:val="single" w:color="9C9382" w:sz="4"/>
-            </w:tcBorders>
-            <w:shd w:fill="F4EFE5" w:color="auto" w:val="clear"/>
-            <w:tcMar>
-              <w:top w:type="dxa" w:w="70"/>
-              <w:left w:type="dxa" w:w="110"/>
-              <w:bottom w:type="dxa" w:w="70"/>
-              <w:right w:type="dxa" w:w="110"/>
+            <w:tcW w:type="dxa" w:w="1769"/>
+            <w:tcBorders>
+              <w:top w:val="single" w:color="9C9382" w:sz="4"/>
+              <w:left w:val="single" w:color="9C9382" w:sz="4"/>
+              <w:bottom w:val="single" w:color="9C9382" w:sz="4"/>
+              <w:right w:val="single" w:color="9C9382" w:sz="4"/>
+            </w:tcBorders>
+            <w:shd w:fill="1D3C34" w:color="auto" w:val="clear"/>
+            <w:tcMar>
+              <w:top w:type="dxa" w:w="60"/>
+              <w:left w:type="dxa" w:w="80"/>
+              <w:bottom w:type="dxa" w:w="60"/>
+              <w:right w:type="dxa" w:w="80"/>
             </w:tcMar>
             <w:vAlign w:val="center"/>
           </w:tcPr>
@@ -848,17 +446,20 @@
                 <w:rFonts w:ascii="Calibri" w:cs="Calibri" w:eastAsia="Calibri" w:hAnsi="Calibri"/>
                 <w:b/>
                 <w:bCs/>
-                <w:color w:val="1D3C34"/>
-                <w:sz w:val="18"/>
-                <w:szCs w:val="18"/>
-              </w:rPr>
-              <w:t xml:space="preserve">9</w:t>
+                <w:color w:val="F6F1E6"/>
+                <w:spacing w:val="10"/>
+                <w:sz w:val="13"/>
+                <w:szCs w:val="13"/>
+              </w:rPr>
+              <w:t xml:space="preserve">LEVEL 9</w:t>
             </w:r>
           </w:p>
         </w:tc>
-        <w:tc>
-          <w:tcPr>
-            <w:tcW w:type="dxa" w:w="1800"/>
+      </w:tr>
+      <w:tr>
+        <w:tc>
+          <w:tcPr>
+            <w:tcW w:type="dxa" w:w="900"/>
             <w:tcBorders>
               <w:top w:val="single" w:color="9C9382" w:sz="4"/>
               <w:left w:val="single" w:color="9C9382" w:sz="4"/>
@@ -867,10 +468,10 @@
             </w:tcBorders>
             <w:shd w:fill="F4EFE5" w:color="auto" w:val="clear"/>
             <w:tcMar>
-              <w:top w:type="dxa" w:w="70"/>
-              <w:left w:type="dxa" w:w="110"/>
-              <w:bottom w:type="dxa" w:w="70"/>
-              <w:right w:type="dxa" w:w="110"/>
+              <w:top w:type="dxa" w:w="60"/>
+              <w:left w:type="dxa" w:w="80"/>
+              <w:bottom w:type="dxa" w:w="60"/>
+              <w:right w:type="dxa" w:w="80"/>
             </w:tcMar>
             <w:vAlign w:val="center"/>
           </w:tcPr>
@@ -880,17 +481,180 @@
                 <w:rFonts w:ascii="Calibri" w:cs="Calibri" w:eastAsia="Calibri" w:hAnsi="Calibri"/>
                 <w:b/>
                 <w:bCs/>
+                <w:color w:val="645D54"/>
+                <w:spacing w:val="8"/>
+                <w:sz w:val="12"/>
+                <w:szCs w:val="12"/>
+              </w:rPr>
+              <w:t xml:space="preserve">SKILL FOCUS</w:t>
+            </w:r>
+          </w:p>
+        </w:tc>
+        <w:tc>
+          <w:tcPr>
+            <w:tcW w:type="dxa" w:w="1769"/>
+            <w:tcBorders>
+              <w:top w:val="single" w:color="9C9382" w:sz="4"/>
+              <w:left w:val="single" w:color="9C9382" w:sz="4"/>
+              <w:bottom w:val="single" w:color="9C9382" w:sz="4"/>
+              <w:right w:val="single" w:color="9C9382" w:sz="4"/>
+            </w:tcBorders>
+            <w:shd w:fill="FFFFFF" w:color="auto" w:val="clear"/>
+            <w:tcMar>
+              <w:top w:type="dxa" w:w="60"/>
+              <w:left w:type="dxa" w:w="80"/>
+              <w:bottom w:type="dxa" w:w="60"/>
+              <w:right w:type="dxa" w:w="80"/>
+            </w:tcMar>
+            <w:vAlign w:val="center"/>
+          </w:tcPr>
+          <w:p>
+            <w:r>
+              <w:rPr>
+                <w:rFonts w:ascii="Calibri" w:cs="Calibri" w:eastAsia="Calibri" w:hAnsi="Calibri"/>
+                <w:b/>
+                <w:bCs/>
                 <w:color w:val="1E211F"/>
-                <w:sz w:val="14"/>
-                <w:szCs w:val="14"/>
+                <w:sz w:val="12"/>
+                <w:szCs w:val="12"/>
+              </w:rPr>
+              <w:t xml:space="preserve">Say what happens</w:t>
+            </w:r>
+          </w:p>
+        </w:tc>
+        <w:tc>
+          <w:tcPr>
+            <w:tcW w:type="dxa" w:w="1769"/>
+            <w:tcBorders>
+              <w:top w:val="single" w:color="9C9382" w:sz="4"/>
+              <w:left w:val="single" w:color="9C9382" w:sz="4"/>
+              <w:bottom w:val="single" w:color="9C9382" w:sz="4"/>
+              <w:right w:val="single" w:color="9C9382" w:sz="4"/>
+            </w:tcBorders>
+            <w:shd w:fill="FFFFFF" w:color="auto" w:val="clear"/>
+            <w:tcMar>
+              <w:top w:type="dxa" w:w="60"/>
+              <w:left w:type="dxa" w:w="80"/>
+              <w:bottom w:type="dxa" w:w="60"/>
+              <w:right w:type="dxa" w:w="80"/>
+            </w:tcMar>
+            <w:vAlign w:val="center"/>
+          </w:tcPr>
+          <w:p>
+            <w:r>
+              <w:rPr>
+                <w:rFonts w:ascii="Calibri" w:cs="Calibri" w:eastAsia="Calibri" w:hAnsi="Calibri"/>
+                <w:b/>
+                <w:bCs/>
+                <w:color w:val="1E211F"/>
+                <w:sz w:val="12"/>
+                <w:szCs w:val="12"/>
+              </w:rPr>
+              <w:t xml:space="preserve">Describe it, with evidence</w:t>
+            </w:r>
+          </w:p>
+        </w:tc>
+        <w:tc>
+          <w:tcPr>
+            <w:tcW w:type="dxa" w:w="1769"/>
+            <w:tcBorders>
+              <w:top w:val="single" w:color="9C9382" w:sz="4"/>
+              <w:left w:val="single" w:color="9C9382" w:sz="4"/>
+              <w:bottom w:val="single" w:color="9C9382" w:sz="4"/>
+              <w:right w:val="single" w:color="9C9382" w:sz="4"/>
+            </w:tcBorders>
+            <w:shd w:fill="FFFFFF" w:color="auto" w:val="clear"/>
+            <w:tcMar>
+              <w:top w:type="dxa" w:w="60"/>
+              <w:left w:type="dxa" w:w="80"/>
+              <w:bottom w:type="dxa" w:w="60"/>
+              <w:right w:type="dxa" w:w="80"/>
+            </w:tcMar>
+            <w:vAlign w:val="center"/>
+          </w:tcPr>
+          <w:p>
+            <w:r>
+              <w:rPr>
+                <w:rFonts w:ascii="Calibri" w:cs="Calibri" w:eastAsia="Calibri" w:hAnsi="Calibri"/>
+                <w:b/>
+                <w:bCs/>
+                <w:color w:val="1E211F"/>
+                <w:sz w:val="12"/>
+                <w:szCs w:val="12"/>
+              </w:rPr>
+              <w:t xml:space="preserve">Explain the effect</w:t>
+            </w:r>
+          </w:p>
+        </w:tc>
+        <w:tc>
+          <w:tcPr>
+            <w:tcW w:type="dxa" w:w="1769"/>
+            <w:tcBorders>
+              <w:top w:val="single" w:color="9C9382" w:sz="4"/>
+              <w:left w:val="single" w:color="9C9382" w:sz="4"/>
+              <w:bottom w:val="single" w:color="9C9382" w:sz="4"/>
+              <w:right w:val="single" w:color="9C9382" w:sz="4"/>
+            </w:tcBorders>
+            <w:shd w:fill="FFFFFF" w:color="auto" w:val="clear"/>
+            <w:tcMar>
+              <w:top w:type="dxa" w:w="60"/>
+              <w:left w:type="dxa" w:w="80"/>
+              <w:bottom w:type="dxa" w:w="60"/>
+              <w:right w:type="dxa" w:w="80"/>
+            </w:tcMar>
+            <w:vAlign w:val="center"/>
+          </w:tcPr>
+          <w:p>
+            <w:r>
+              <w:rPr>
+                <w:rFonts w:ascii="Calibri" w:cs="Calibri" w:eastAsia="Calibri" w:hAnsi="Calibri"/>
+                <w:b/>
+                <w:bCs/>
+                <w:color w:val="1E211F"/>
+                <w:sz w:val="12"/>
+                <w:szCs w:val="12"/>
+              </w:rPr>
+              <w:t xml:space="preserve">Analyse the choice</w:t>
+            </w:r>
+          </w:p>
+        </w:tc>
+        <w:tc>
+          <w:tcPr>
+            <w:tcW w:type="dxa" w:w="1769"/>
+            <w:tcBorders>
+              <w:top w:val="single" w:color="9C9382" w:sz="4"/>
+              <w:left w:val="single" w:color="9C9382" w:sz="4"/>
+              <w:bottom w:val="single" w:color="9C9382" w:sz="4"/>
+              <w:right w:val="single" w:color="9C9382" w:sz="4"/>
+            </w:tcBorders>
+            <w:shd w:fill="FFFFFF" w:color="auto" w:val="clear"/>
+            <w:tcMar>
+              <w:top w:type="dxa" w:w="60"/>
+              <w:left w:type="dxa" w:w="80"/>
+              <w:bottom w:type="dxa" w:w="60"/>
+              <w:right w:type="dxa" w:w="80"/>
+            </w:tcMar>
+            <w:vAlign w:val="center"/>
+          </w:tcPr>
+          <w:p>
+            <w:r>
+              <w:rPr>
+                <w:rFonts w:ascii="Calibri" w:cs="Calibri" w:eastAsia="Calibri" w:hAnsi="Calibri"/>
+                <w:b/>
+                <w:bCs/>
+                <w:color w:val="1E211F"/>
+                <w:sz w:val="12"/>
+                <w:szCs w:val="12"/>
               </w:rPr>
               <w:t xml:space="preserve">Question the representation</w:t>
             </w:r>
           </w:p>
         </w:tc>
-        <w:tc>
-          <w:tcPr>
-            <w:tcW w:type="dxa" w:w="7196"/>
+      </w:tr>
+      <w:tr>
+        <w:tc>
+          <w:tcPr>
+            <w:tcW w:type="dxa" w:w="900"/>
             <w:tcBorders>
               <w:top w:val="single" w:color="9C9382" w:sz="4"/>
               <w:left w:val="single" w:color="9C9382" w:sz="4"/>
@@ -899,10 +663,10 @@
             </w:tcBorders>
             <w:shd w:fill="F4EFE5" w:color="auto" w:val="clear"/>
             <w:tcMar>
-              <w:top w:type="dxa" w:w="70"/>
-              <w:left w:type="dxa" w:w="110"/>
-              <w:bottom w:type="dxa" w:w="70"/>
-              <w:right w:type="dxa" w:w="110"/>
+              <w:top w:type="dxa" w:w="60"/>
+              <w:left w:type="dxa" w:w="80"/>
+              <w:bottom w:type="dxa" w:w="60"/>
+              <w:right w:type="dxa" w:w="80"/>
             </w:tcMar>
             <w:vAlign w:val="center"/>
           </w:tcPr>
@@ -910,9 +674,84 @@
             <w:r>
               <w:rPr>
                 <w:rFonts w:ascii="Calibri" w:cs="Calibri" w:eastAsia="Calibri" w:hAnsi="Calibri"/>
+                <w:b/>
+                <w:bCs/>
+                <w:color w:val="645D54"/>
+                <w:spacing w:val="8"/>
+                <w:sz w:val="12"/>
+                <w:szCs w:val="12"/>
+              </w:rPr>
+              <w:t xml:space="preserve">WHAT YOU NEED TO SHOW</w:t>
+            </w:r>
+          </w:p>
+        </w:tc>
+        <w:tc>
+          <w:tcPr>
+            <w:tcW w:type="dxa" w:w="1769"/>
+            <w:tcBorders>
+              <w:top w:val="single" w:color="9C9382" w:sz="4"/>
+              <w:left w:val="single" w:color="9C9382" w:sz="4"/>
+              <w:bottom w:val="single" w:color="9C9382" w:sz="4"/>
+              <w:right w:val="single" w:color="9C9382" w:sz="4"/>
+            </w:tcBorders>
+            <w:shd w:fill="FFFFFF" w:color="auto" w:val="clear"/>
+            <w:tcMar>
+              <w:top w:type="dxa" w:w="60"/>
+              <w:left w:type="dxa" w:w="80"/>
+              <w:bottom w:type="dxa" w:w="60"/>
+              <w:right w:type="dxa" w:w="80"/>
+            </w:tcMar>
+            <w:vAlign w:val="center"/>
+          </w:tcPr>
+          <w:p>
+            <w:r>
+              <w:rPr>
+                <w:rFonts w:ascii="Calibri" w:cs="Calibri" w:eastAsia="Calibri" w:hAnsi="Calibri"/>
                 <w:color w:val="1E211F"/>
-                <w:sz w:val="14"/>
-                <w:szCs w:val="14"/>
+                <w:sz w:val="12"/>
+                <w:szCs w:val="12"/>
+              </w:rPr>
+              <w:t xml:space="preserve">I can identify parts of the story that relate to </w:t>
+            </w:r>
+            <w:r>
+              <w:rPr>
+                <w:rFonts w:ascii="Calibri" w:cs="Calibri" w:eastAsia="Calibri" w:hAnsi="Calibri"/>
+                <w:b/>
+                <w:bCs/>
+                <w:color w:val="0B447C"/>
+                <w:sz w:val="12"/>
+                <w:szCs w:val="12"/>
+                <w:shd w:fill="D6EAFC" w:val="clear"/>
+              </w:rPr>
+              <w:t xml:space="preserve">key ideas</w:t>
+            </w:r>
+          </w:p>
+        </w:tc>
+        <w:tc>
+          <w:tcPr>
+            <w:tcW w:type="dxa" w:w="1769"/>
+            <w:tcBorders>
+              <w:top w:val="single" w:color="9C9382" w:sz="4"/>
+              <w:left w:val="single" w:color="9C9382" w:sz="4"/>
+              <w:bottom w:val="single" w:color="9C9382" w:sz="4"/>
+              <w:right w:val="single" w:color="9C9382" w:sz="4"/>
+            </w:tcBorders>
+            <w:shd w:fill="FFFFFF" w:color="auto" w:val="clear"/>
+            <w:tcMar>
+              <w:top w:type="dxa" w:w="60"/>
+              <w:left w:type="dxa" w:w="80"/>
+              <w:bottom w:type="dxa" w:w="60"/>
+              <w:right w:type="dxa" w:w="80"/>
+            </w:tcMar>
+            <w:vAlign w:val="center"/>
+          </w:tcPr>
+          <w:p>
+            <w:r>
+              <w:rPr>
+                <w:rFonts w:ascii="Calibri" w:cs="Calibri" w:eastAsia="Calibri" w:hAnsi="Calibri"/>
+                <w:color w:val="1E211F"/>
+                <w:sz w:val="12"/>
+                <w:szCs w:val="12"/>
               </w:rPr>
               <w:t xml:space="preserve">I can </w:t>
             </w:r>
@@ -921,9 +760,174 @@
                 <w:rFonts w:ascii="Calibri" w:cs="Calibri" w:eastAsia="Calibri" w:hAnsi="Calibri"/>
                 <w:b/>
                 <w:bCs/>
+                <w:color w:val="7A5A00"/>
+                <w:sz w:val="12"/>
+                <w:szCs w:val="12"/>
+                <w:shd w:fill="FFF3B0" w:val="clear"/>
+              </w:rPr>
+              <w:t xml:space="preserve">describe characters and events</w:t>
+            </w:r>
+            <w:r>
+              <w:rPr>
+                <w:rFonts w:ascii="Calibri" w:cs="Calibri" w:eastAsia="Calibri" w:hAnsi="Calibri"/>
+                <w:color w:val="1E211F"/>
+                <w:sz w:val="12"/>
+                <w:szCs w:val="12"/>
+              </w:rPr>
+              <w:t xml:space="preserve"> that relate to </w:t>
+            </w:r>
+            <w:r>
+              <w:rPr>
+                <w:rFonts w:ascii="Calibri" w:cs="Calibri" w:eastAsia="Calibri" w:hAnsi="Calibri"/>
+                <w:b/>
+                <w:bCs/>
+                <w:color w:val="0B447C"/>
+                <w:sz w:val="12"/>
+                <w:szCs w:val="12"/>
+                <w:shd w:fill="D6EAFC" w:val="clear"/>
+              </w:rPr>
+              <w:t xml:space="preserve">key ideas</w:t>
+            </w:r>
+          </w:p>
+        </w:tc>
+        <w:tc>
+          <w:tcPr>
+            <w:tcW w:type="dxa" w:w="1769"/>
+            <w:tcBorders>
+              <w:top w:val="single" w:color="9C9382" w:sz="4"/>
+              <w:left w:val="single" w:color="9C9382" w:sz="4"/>
+              <w:bottom w:val="single" w:color="9C9382" w:sz="4"/>
+              <w:right w:val="single" w:color="9C9382" w:sz="4"/>
+            </w:tcBorders>
+            <w:shd w:fill="FFFFFF" w:color="auto" w:val="clear"/>
+            <w:tcMar>
+              <w:top w:type="dxa" w:w="60"/>
+              <w:left w:type="dxa" w:w="80"/>
+              <w:bottom w:type="dxa" w:w="60"/>
+              <w:right w:type="dxa" w:w="80"/>
+            </w:tcMar>
+            <w:vAlign w:val="center"/>
+          </w:tcPr>
+          <w:p>
+            <w:r>
+              <w:rPr>
+                <w:rFonts w:ascii="Calibri" w:cs="Calibri" w:eastAsia="Calibri" w:hAnsi="Calibri"/>
+                <w:color w:val="1E211F"/>
+                <w:sz w:val="12"/>
+                <w:szCs w:val="12"/>
+              </w:rPr>
+              <w:t xml:space="preserve">I can describe the </w:t>
+            </w:r>
+            <w:r>
+              <w:rPr>
+                <w:rFonts w:ascii="Calibri" w:cs="Calibri" w:eastAsia="Calibri" w:hAnsi="Calibri"/>
+                <w:b/>
+                <w:bCs/>
+                <w:color w:val="0B447C"/>
+                <w:sz w:val="12"/>
+                <w:szCs w:val="12"/>
+                <w:shd w:fill="D6EAFC" w:val="clear"/>
+              </w:rPr>
+              <w:t xml:space="preserve">ideas and issues that are illustrated</w:t>
+            </w:r>
+            <w:r>
+              <w:rPr>
+                <w:rFonts w:ascii="Calibri" w:cs="Calibri" w:eastAsia="Calibri" w:hAnsi="Calibri"/>
+                <w:color w:val="1E211F"/>
+                <w:sz w:val="12"/>
+                <w:szCs w:val="12"/>
+              </w:rPr>
+              <w:t xml:space="preserve"> through characters and events</w:t>
+            </w:r>
+          </w:p>
+        </w:tc>
+        <w:tc>
+          <w:tcPr>
+            <w:tcW w:type="dxa" w:w="1769"/>
+            <w:tcBorders>
+              <w:top w:val="single" w:color="9C9382" w:sz="4"/>
+              <w:left w:val="single" w:color="9C9382" w:sz="4"/>
+              <w:bottom w:val="single" w:color="9C9382" w:sz="4"/>
+              <w:right w:val="single" w:color="9C9382" w:sz="4"/>
+            </w:tcBorders>
+            <w:shd w:fill="FFFFFF" w:color="auto" w:val="clear"/>
+            <w:tcMar>
+              <w:top w:type="dxa" w:w="60"/>
+              <w:left w:type="dxa" w:w="80"/>
+              <w:bottom w:type="dxa" w:w="60"/>
+              <w:right w:type="dxa" w:w="80"/>
+            </w:tcMar>
+            <w:vAlign w:val="center"/>
+          </w:tcPr>
+          <w:p>
+            <w:r>
+              <w:rPr>
+                <w:rFonts w:ascii="Calibri" w:cs="Calibri" w:eastAsia="Calibri" w:hAnsi="Calibri"/>
+                <w:color w:val="1E211F"/>
+                <w:sz w:val="12"/>
+                <w:szCs w:val="12"/>
+              </w:rPr>
+              <w:t xml:space="preserve">I can explain the way </w:t>
+            </w:r>
+            <w:r>
+              <w:rPr>
+                <w:rFonts w:ascii="Calibri" w:cs="Calibri" w:eastAsia="Calibri" w:hAnsi="Calibri"/>
+                <w:b/>
+                <w:bCs/>
+                <w:color w:val="0B447C"/>
+                <w:sz w:val="12"/>
+                <w:szCs w:val="12"/>
+                <w:shd w:fill="D6EAFC" w:val="clear"/>
+              </w:rPr>
+              <w:t xml:space="preserve">different perspectives</w:t>
+            </w:r>
+            <w:r>
+              <w:rPr>
+                <w:rFonts w:ascii="Calibri" w:cs="Calibri" w:eastAsia="Calibri" w:hAnsi="Calibri"/>
+                <w:color w:val="1E211F"/>
+                <w:sz w:val="12"/>
+                <w:szCs w:val="12"/>
+              </w:rPr>
+              <w:t xml:space="preserve"> on ideas are represented through characters and events</w:t>
+            </w:r>
+          </w:p>
+        </w:tc>
+        <w:tc>
+          <w:tcPr>
+            <w:tcW w:type="dxa" w:w="1769"/>
+            <w:tcBorders>
+              <w:top w:val="single" w:color="9C9382" w:sz="4"/>
+              <w:left w:val="single" w:color="9C9382" w:sz="4"/>
+              <w:bottom w:val="single" w:color="9C9382" w:sz="4"/>
+              <w:right w:val="single" w:color="9C9382" w:sz="4"/>
+            </w:tcBorders>
+            <w:shd w:fill="FFFFFF" w:color="auto" w:val="clear"/>
+            <w:tcMar>
+              <w:top w:type="dxa" w:w="60"/>
+              <w:left w:type="dxa" w:w="80"/>
+              <w:bottom w:type="dxa" w:w="60"/>
+              <w:right w:type="dxa" w:w="80"/>
+            </w:tcMar>
+            <w:vAlign w:val="center"/>
+          </w:tcPr>
+          <w:p>
+            <w:r>
+              <w:rPr>
+                <w:rFonts w:ascii="Calibri" w:cs="Calibri" w:eastAsia="Calibri" w:hAnsi="Calibri"/>
+                <w:color w:val="1E211F"/>
+                <w:sz w:val="12"/>
+                <w:szCs w:val="12"/>
+              </w:rPr>
+              <w:t xml:space="preserve">I can </w:t>
+            </w:r>
+            <w:r>
+              <w:rPr>
+                <w:rFonts w:ascii="Calibri" w:cs="Calibri" w:eastAsia="Calibri" w:hAnsi="Calibri"/>
+                <w:b/>
+                <w:bCs/>
                 <w:color w:val="8A4B12"/>
-                <w:sz w:val="14"/>
-                <w:szCs w:val="14"/>
+                <w:sz w:val="12"/>
+                <w:szCs w:val="12"/>
                 <w:shd w:fill="FAE3CF" w:val="clear"/>
               </w:rPr>
               <w:t xml:space="preserve">analyse</w:t>
@@ -932,8 +936,8 @@
               <w:rPr>
                 <w:rFonts w:ascii="Calibri" w:cs="Calibri" w:eastAsia="Calibri" w:hAnsi="Calibri"/>
                 <w:color w:val="1E211F"/>
-                <w:sz w:val="14"/>
-                <w:szCs w:val="14"/>
+                <w:sz w:val="12"/>
+                <w:szCs w:val="12"/>
               </w:rPr>
               <w:t xml:space="preserve"> the way different people and perspectives are </w:t>
             </w:r>
@@ -943,8 +947,8 @@
                 <w:b/>
                 <w:bCs/>
                 <w:color w:val="0B447C"/>
-                <w:sz w:val="14"/>
-                <w:szCs w:val="14"/>
+                <w:sz w:val="12"/>
+                <w:szCs w:val="12"/>
                 <w:shd w:fill="D6EAFC" w:val="clear"/>
               </w:rPr>
               <w:t xml:space="preserve">represented</w:t>
@@ -953,8 +957,8 @@
               <w:rPr>
                 <w:rFonts w:ascii="Calibri" w:cs="Calibri" w:eastAsia="Calibri" w:hAnsi="Calibri"/>
                 <w:color w:val="1E211F"/>
-                <w:sz w:val="14"/>
-                <w:szCs w:val="14"/>
+                <w:sz w:val="12"/>
+                <w:szCs w:val="12"/>
               </w:rPr>
               <w:t xml:space="preserve"> in the story</w:t>
             </w:r>
@@ -1070,6 +1074,66 @@
           <w:szCs w:val="15"/>
         </w:rPr>
         <w:t xml:space="preserve">REWRITE</w:t>
+      </w:r>
+    </w:p>
+    <w:p>
+      <w:pPr>
+        <w:pBdr>
+          <w:bottom w:val="single" w:color="C9BFAE" w:sz="4" w:space="1"/>
+        </w:pBdr>
+        <w:spacing w:after="80" w:before="0" w:line="340"/>
+      </w:pPr>
+      <w:r>
+        <w:rPr>
+          <w:sz w:val="20"/>
+          <w:szCs w:val="20"/>
+        </w:rPr>
+        <w:t xml:space="preserve"/>
+      </w:r>
+    </w:p>
+    <w:p>
+      <w:pPr>
+        <w:pBdr>
+          <w:bottom w:val="single" w:color="C9BFAE" w:sz="4" w:space="1"/>
+        </w:pBdr>
+        <w:spacing w:after="80" w:before="0" w:line="340"/>
+      </w:pPr>
+      <w:r>
+        <w:rPr>
+          <w:sz w:val="20"/>
+          <w:szCs w:val="20"/>
+        </w:rPr>
+        <w:t xml:space="preserve"/>
+      </w:r>
+    </w:p>
+    <w:p>
+      <w:pPr>
+        <w:pBdr>
+          <w:bottom w:val="single" w:color="C9BFAE" w:sz="4" w:space="1"/>
+        </w:pBdr>
+        <w:spacing w:after="80" w:before="0" w:line="340"/>
+      </w:pPr>
+      <w:r>
+        <w:rPr>
+          <w:sz w:val="20"/>
+          <w:szCs w:val="20"/>
+        </w:rPr>
+        <w:t xml:space="preserve"/>
+      </w:r>
+    </w:p>
+    <w:p>
+      <w:pPr>
+        <w:pBdr>
+          <w:bottom w:val="single" w:color="C9BFAE" w:sz="4" w:space="1"/>
+        </w:pBdr>
+        <w:spacing w:after="80" w:before="0" w:line="340"/>
+      </w:pPr>
+      <w:r>
+        <w:rPr>
+          <w:sz w:val="20"/>
+          <w:szCs w:val="20"/>
+        </w:rPr>
+        <w:t xml:space="preserve"/>
       </w:r>
     </w:p>
     <w:p>

</xml_diff>